<commit_message>
Actualizando el repositorio con los cambios realizados en la rama main
</commit_message>
<xml_diff>
--- a/polibrio.docx
+++ b/polibrio.docx
@@ -429,11 +429,16 @@
         <w:t xml:space="preserve">Mensaje: </w:t>
       </w:r>
       <w:r>
-        <w:t>d, h</w:t>
+        <w:t xml:space="preserve">d, </w:t>
+      </w:r>
+      <w:proofErr w:type="spellStart"/>
+      <w:r>
+        <w:t>h</w:t>
       </w:r>
       <w:r>
         <w:t>olamundo</w:t>
       </w:r>
+      <w:proofErr w:type="spellEnd"/>
     </w:p>
     <w:p>
       <w:pPr>
@@ -3132,27 +3137,6 @@
       </w:tr>
     </w:tbl>
     <w:p>
-      <w:pPr>
-        <w:tabs>
-          <w:tab w:val="center" w:pos="2866"/>
-        </w:tabs>
-      </w:pPr>
-    </w:p>
-    <w:p>
-      <w:pPr>
-        <w:tabs>
-          <w:tab w:val="center" w:pos="2866"/>
-        </w:tabs>
-      </w:pPr>
-    </w:p>
-    <w:p>
-      <w:pPr>
-        <w:tabs>
-          <w:tab w:val="center" w:pos="2866"/>
-        </w:tabs>
-      </w:pPr>
-    </w:p>
-    <w:p>
       <w:r>
         <w:t xml:space="preserve">Mensaje: </w:t>
       </w:r>
@@ -3160,8 +3144,13 @@
         <w:t>e</w:t>
       </w:r>
       <w:r>
-        <w:t>, hokxnfdco</w:t>
+        <w:t xml:space="preserve">, </w:t>
       </w:r>
+      <w:proofErr w:type="spellStart"/>
+      <w:r>
+        <w:t>hokxnfdco</w:t>
+      </w:r>
+      <w:proofErr w:type="spellEnd"/>
     </w:p>
     <w:tbl>
       <w:tblPr>
@@ -3638,11 +3627,7 @@
         </w:tc>
       </w:tr>
     </w:tbl>
-    <w:p>
-      <w:pPr>
-        <w:jc w:val="center"/>
-      </w:pPr>
-    </w:p>
+    <w:p/>
     <w:tbl>
       <w:tblPr>
         <w:tblStyle w:val="Tablaconcuadrcula"/>
@@ -3809,7 +3794,6 @@
               <w:jc w:val="center"/>
             </w:pPr>
             <w:r>
-              <w:lastRenderedPageBreak/>
               <w:t>2</w:t>
             </w:r>
           </w:p>
@@ -4075,10 +4059,3754 @@
     </w:tbl>
     <w:p/>
     <w:p>
+      <w:proofErr w:type="spellStart"/>
+      <w:r>
+        <w:t>H</w:t>
+      </w:r>
+      <w:r>
+        <w:t>meumikdmz</w:t>
+      </w:r>
+      <w:proofErr w:type="spellEnd"/>
+    </w:p>
+    <w:tbl>
+      <w:tblPr>
+        <w:tblStyle w:val="Tablaconcuadrcula"/>
+        <w:tblpPr w:leftFromText="141" w:rightFromText="141" w:vertAnchor="text" w:tblpY="1"/>
+        <w:tblOverlap w:val="never"/>
+        <w:tblW w:w="0" w:type="auto"/>
+        <w:tblLook w:val="04A0" w:firstRow="1" w:lastRow="0" w:firstColumn="1" w:lastColumn="0" w:noHBand="0" w:noVBand="1"/>
+      </w:tblPr>
+      <w:tblGrid>
+        <w:gridCol w:w="429"/>
+        <w:gridCol w:w="445"/>
+        <w:gridCol w:w="445"/>
+        <w:gridCol w:w="445"/>
+        <w:gridCol w:w="445"/>
+        <w:gridCol w:w="445"/>
+        <w:gridCol w:w="445"/>
+        <w:gridCol w:w="445"/>
+      </w:tblGrid>
+      <w:tr>
+        <w:trPr>
+          <w:trHeight w:val="543"/>
+        </w:trPr>
+        <w:tc>
+          <w:tcPr>
+            <w:tcW w:w="429" w:type="dxa"/>
+          </w:tcPr>
+          <w:p>
+            <w:pPr>
+              <w:spacing w:after="160" w:line="259" w:lineRule="auto"/>
+            </w:pPr>
+          </w:p>
+        </w:tc>
+        <w:tc>
+          <w:tcPr>
+            <w:tcW w:w="445" w:type="dxa"/>
+          </w:tcPr>
+          <w:p>
+            <w:pPr>
+              <w:spacing w:after="160" w:line="259" w:lineRule="auto"/>
+            </w:pPr>
+            <w:r>
+              <w:t>C0</w:t>
+            </w:r>
+          </w:p>
+        </w:tc>
+        <w:tc>
+          <w:tcPr>
+            <w:tcW w:w="445" w:type="dxa"/>
+          </w:tcPr>
+          <w:p>
+            <w:pPr>
+              <w:spacing w:after="160" w:line="259" w:lineRule="auto"/>
+            </w:pPr>
+            <w:r>
+              <w:t>C1</w:t>
+            </w:r>
+          </w:p>
+        </w:tc>
+        <w:tc>
+          <w:tcPr>
+            <w:tcW w:w="445" w:type="dxa"/>
+          </w:tcPr>
+          <w:p>
+            <w:pPr>
+              <w:spacing w:after="160" w:line="259" w:lineRule="auto"/>
+            </w:pPr>
+            <w:r>
+              <w:t>C2</w:t>
+            </w:r>
+          </w:p>
+        </w:tc>
+        <w:tc>
+          <w:tcPr>
+            <w:tcW w:w="445" w:type="dxa"/>
+          </w:tcPr>
+          <w:p>
+            <w:pPr>
+              <w:spacing w:after="160" w:line="259" w:lineRule="auto"/>
+            </w:pPr>
+            <w:r>
+              <w:t>C3</w:t>
+            </w:r>
+          </w:p>
+        </w:tc>
+        <w:tc>
+          <w:tcPr>
+            <w:tcW w:w="445" w:type="dxa"/>
+          </w:tcPr>
+          <w:p>
+            <w:pPr>
+              <w:spacing w:after="160" w:line="259" w:lineRule="auto"/>
+            </w:pPr>
+            <w:r>
+              <w:t>C4</w:t>
+            </w:r>
+          </w:p>
+        </w:tc>
+        <w:tc>
+          <w:tcPr>
+            <w:tcW w:w="445" w:type="dxa"/>
+          </w:tcPr>
+          <w:p>
+            <w:r>
+              <w:t>C5</w:t>
+            </w:r>
+          </w:p>
+        </w:tc>
+        <w:tc>
+          <w:tcPr>
+            <w:tcW w:w="445" w:type="dxa"/>
+          </w:tcPr>
+          <w:p>
+            <w:r>
+              <w:t>C6</w:t>
+            </w:r>
+          </w:p>
+        </w:tc>
+      </w:tr>
+      <w:tr>
+        <w:trPr>
+          <w:trHeight w:val="543"/>
+        </w:trPr>
+        <w:tc>
+          <w:tcPr>
+            <w:tcW w:w="429" w:type="dxa"/>
+          </w:tcPr>
+          <w:p>
+            <w:pPr>
+              <w:spacing w:after="160" w:line="259" w:lineRule="auto"/>
+            </w:pPr>
+            <w:r>
+              <w:t>F0</w:t>
+            </w:r>
+          </w:p>
+        </w:tc>
+        <w:tc>
+          <w:tcPr>
+            <w:tcW w:w="445" w:type="dxa"/>
+          </w:tcPr>
+          <w:p>
+            <w:pPr>
+              <w:spacing w:after="160" w:line="259" w:lineRule="auto"/>
+            </w:pPr>
+            <w:r>
+              <w:t>A</w:t>
+            </w:r>
+          </w:p>
+        </w:tc>
+        <w:tc>
+          <w:tcPr>
+            <w:tcW w:w="445" w:type="dxa"/>
+          </w:tcPr>
+          <w:p>
+            <w:pPr>
+              <w:spacing w:after="160" w:line="259" w:lineRule="auto"/>
+            </w:pPr>
+            <w:r>
+              <w:t>B</w:t>
+            </w:r>
+          </w:p>
+        </w:tc>
+        <w:tc>
+          <w:tcPr>
+            <w:tcW w:w="445" w:type="dxa"/>
+          </w:tcPr>
+          <w:p>
+            <w:pPr>
+              <w:spacing w:after="160" w:line="259" w:lineRule="auto"/>
+            </w:pPr>
+            <w:r>
+              <w:t>C</w:t>
+            </w:r>
+          </w:p>
+        </w:tc>
+        <w:tc>
+          <w:tcPr>
+            <w:tcW w:w="445" w:type="dxa"/>
+          </w:tcPr>
+          <w:p>
+            <w:pPr>
+              <w:spacing w:after="160" w:line="259" w:lineRule="auto"/>
+            </w:pPr>
+            <w:r>
+              <w:t>D</w:t>
+            </w:r>
+          </w:p>
+        </w:tc>
+        <w:tc>
+          <w:tcPr>
+            <w:tcW w:w="445" w:type="dxa"/>
+          </w:tcPr>
+          <w:p>
+            <w:pPr>
+              <w:spacing w:after="160" w:line="259" w:lineRule="auto"/>
+            </w:pPr>
+            <w:r>
+              <w:t>E</w:t>
+            </w:r>
+          </w:p>
+        </w:tc>
+        <w:tc>
+          <w:tcPr>
+            <w:tcW w:w="445" w:type="dxa"/>
+          </w:tcPr>
+          <w:p/>
+        </w:tc>
+        <w:tc>
+          <w:tcPr>
+            <w:tcW w:w="445" w:type="dxa"/>
+          </w:tcPr>
+          <w:p/>
+        </w:tc>
+      </w:tr>
+      <w:tr>
+        <w:trPr>
+          <w:trHeight w:val="567"/>
+        </w:trPr>
+        <w:tc>
+          <w:tcPr>
+            <w:tcW w:w="429" w:type="dxa"/>
+          </w:tcPr>
+          <w:p>
+            <w:pPr>
+              <w:spacing w:after="160" w:line="259" w:lineRule="auto"/>
+            </w:pPr>
+            <w:r>
+              <w:t>F1</w:t>
+            </w:r>
+          </w:p>
+        </w:tc>
+        <w:tc>
+          <w:tcPr>
+            <w:tcW w:w="445" w:type="dxa"/>
+          </w:tcPr>
+          <w:p>
+            <w:pPr>
+              <w:spacing w:after="160" w:line="259" w:lineRule="auto"/>
+            </w:pPr>
+            <w:r>
+              <w:t>F</w:t>
+            </w:r>
+          </w:p>
+        </w:tc>
+        <w:tc>
+          <w:tcPr>
+            <w:tcW w:w="445" w:type="dxa"/>
+          </w:tcPr>
+          <w:p>
+            <w:pPr>
+              <w:spacing w:after="160" w:line="259" w:lineRule="auto"/>
+            </w:pPr>
+            <w:r>
+              <w:t>G</w:t>
+            </w:r>
+          </w:p>
+        </w:tc>
+        <w:tc>
+          <w:tcPr>
+            <w:tcW w:w="445" w:type="dxa"/>
+          </w:tcPr>
+          <w:p>
+            <w:pPr>
+              <w:spacing w:after="160" w:line="259" w:lineRule="auto"/>
+            </w:pPr>
+            <w:r>
+              <w:t>H</w:t>
+            </w:r>
+          </w:p>
+        </w:tc>
+        <w:tc>
+          <w:tcPr>
+            <w:tcW w:w="445" w:type="dxa"/>
+          </w:tcPr>
+          <w:p>
+            <w:pPr>
+              <w:spacing w:after="160" w:line="259" w:lineRule="auto"/>
+            </w:pPr>
+            <w:r>
+              <w:t>I</w:t>
+            </w:r>
+          </w:p>
+        </w:tc>
+        <w:tc>
+          <w:tcPr>
+            <w:tcW w:w="445" w:type="dxa"/>
+          </w:tcPr>
+          <w:p>
+            <w:pPr>
+              <w:spacing w:after="160" w:line="259" w:lineRule="auto"/>
+            </w:pPr>
+            <w:r>
+              <w:t>J</w:t>
+            </w:r>
+          </w:p>
+        </w:tc>
+        <w:tc>
+          <w:tcPr>
+            <w:tcW w:w="445" w:type="dxa"/>
+          </w:tcPr>
+          <w:p/>
+        </w:tc>
+        <w:tc>
+          <w:tcPr>
+            <w:tcW w:w="445" w:type="dxa"/>
+          </w:tcPr>
+          <w:p/>
+        </w:tc>
+      </w:tr>
+      <w:tr>
+        <w:trPr>
+          <w:trHeight w:val="543"/>
+        </w:trPr>
+        <w:tc>
+          <w:tcPr>
+            <w:tcW w:w="429" w:type="dxa"/>
+          </w:tcPr>
+          <w:p>
+            <w:pPr>
+              <w:spacing w:after="160" w:line="259" w:lineRule="auto"/>
+            </w:pPr>
+            <w:r>
+              <w:t>F2</w:t>
+            </w:r>
+          </w:p>
+        </w:tc>
+        <w:tc>
+          <w:tcPr>
+            <w:tcW w:w="445" w:type="dxa"/>
+          </w:tcPr>
+          <w:p>
+            <w:pPr>
+              <w:spacing w:after="160" w:line="259" w:lineRule="auto"/>
+            </w:pPr>
+            <w:r>
+              <w:t>K</w:t>
+            </w:r>
+          </w:p>
+        </w:tc>
+        <w:tc>
+          <w:tcPr>
+            <w:tcW w:w="445" w:type="dxa"/>
+          </w:tcPr>
+          <w:p>
+            <w:pPr>
+              <w:spacing w:after="160" w:line="259" w:lineRule="auto"/>
+            </w:pPr>
+            <w:r>
+              <w:t>L</w:t>
+            </w:r>
+          </w:p>
+        </w:tc>
+        <w:tc>
+          <w:tcPr>
+            <w:tcW w:w="445" w:type="dxa"/>
+          </w:tcPr>
+          <w:p>
+            <w:pPr>
+              <w:spacing w:after="160" w:line="259" w:lineRule="auto"/>
+            </w:pPr>
+            <w:r>
+              <w:t>M</w:t>
+            </w:r>
+          </w:p>
+        </w:tc>
+        <w:tc>
+          <w:tcPr>
+            <w:tcW w:w="445" w:type="dxa"/>
+          </w:tcPr>
+          <w:p>
+            <w:pPr>
+              <w:spacing w:after="160" w:line="259" w:lineRule="auto"/>
+            </w:pPr>
+            <w:r>
+              <w:t>N</w:t>
+            </w:r>
+          </w:p>
+        </w:tc>
+        <w:tc>
+          <w:tcPr>
+            <w:tcW w:w="445" w:type="dxa"/>
+          </w:tcPr>
+          <w:p>
+            <w:pPr>
+              <w:spacing w:after="160" w:line="259" w:lineRule="auto"/>
+            </w:pPr>
+            <w:r>
+              <w:t>O</w:t>
+            </w:r>
+          </w:p>
+        </w:tc>
+        <w:tc>
+          <w:tcPr>
+            <w:tcW w:w="445" w:type="dxa"/>
+          </w:tcPr>
+          <w:p/>
+        </w:tc>
+        <w:tc>
+          <w:tcPr>
+            <w:tcW w:w="445" w:type="dxa"/>
+          </w:tcPr>
+          <w:p/>
+        </w:tc>
+      </w:tr>
+      <w:tr>
+        <w:trPr>
+          <w:trHeight w:val="543"/>
+        </w:trPr>
+        <w:tc>
+          <w:tcPr>
+            <w:tcW w:w="429" w:type="dxa"/>
+          </w:tcPr>
+          <w:p>
+            <w:pPr>
+              <w:spacing w:after="160" w:line="259" w:lineRule="auto"/>
+            </w:pPr>
+            <w:r>
+              <w:t>F3</w:t>
+            </w:r>
+          </w:p>
+        </w:tc>
+        <w:tc>
+          <w:tcPr>
+            <w:tcW w:w="445" w:type="dxa"/>
+          </w:tcPr>
+          <w:p>
+            <w:pPr>
+              <w:spacing w:after="160" w:line="259" w:lineRule="auto"/>
+            </w:pPr>
+            <w:r>
+              <w:t>P</w:t>
+            </w:r>
+          </w:p>
+        </w:tc>
+        <w:tc>
+          <w:tcPr>
+            <w:tcW w:w="445" w:type="dxa"/>
+          </w:tcPr>
+          <w:p>
+            <w:pPr>
+              <w:spacing w:after="160" w:line="259" w:lineRule="auto"/>
+            </w:pPr>
+            <w:r>
+              <w:t>Q</w:t>
+            </w:r>
+          </w:p>
+        </w:tc>
+        <w:tc>
+          <w:tcPr>
+            <w:tcW w:w="445" w:type="dxa"/>
+          </w:tcPr>
+          <w:p>
+            <w:pPr>
+              <w:spacing w:after="160" w:line="259" w:lineRule="auto"/>
+            </w:pPr>
+            <w:r>
+              <w:t>R</w:t>
+            </w:r>
+          </w:p>
+        </w:tc>
+        <w:tc>
+          <w:tcPr>
+            <w:tcW w:w="445" w:type="dxa"/>
+          </w:tcPr>
+          <w:p>
+            <w:pPr>
+              <w:spacing w:after="160" w:line="259" w:lineRule="auto"/>
+            </w:pPr>
+            <w:r>
+              <w:t>S</w:t>
+            </w:r>
+          </w:p>
+        </w:tc>
+        <w:tc>
+          <w:tcPr>
+            <w:tcW w:w="445" w:type="dxa"/>
+          </w:tcPr>
+          <w:p>
+            <w:pPr>
+              <w:spacing w:after="160" w:line="259" w:lineRule="auto"/>
+            </w:pPr>
+            <w:r>
+              <w:t>T</w:t>
+            </w:r>
+          </w:p>
+        </w:tc>
+        <w:tc>
+          <w:tcPr>
+            <w:tcW w:w="445" w:type="dxa"/>
+          </w:tcPr>
+          <w:p/>
+        </w:tc>
+        <w:tc>
+          <w:tcPr>
+            <w:tcW w:w="445" w:type="dxa"/>
+          </w:tcPr>
+          <w:p/>
+        </w:tc>
+      </w:tr>
+      <w:tr>
+        <w:trPr>
+          <w:trHeight w:val="543"/>
+        </w:trPr>
+        <w:tc>
+          <w:tcPr>
+            <w:tcW w:w="429" w:type="dxa"/>
+          </w:tcPr>
+          <w:p>
+            <w:pPr>
+              <w:spacing w:after="160" w:line="259" w:lineRule="auto"/>
+            </w:pPr>
+            <w:r>
+              <w:t>F4</w:t>
+            </w:r>
+          </w:p>
+        </w:tc>
+        <w:tc>
+          <w:tcPr>
+            <w:tcW w:w="445" w:type="dxa"/>
+          </w:tcPr>
+          <w:p>
+            <w:pPr>
+              <w:spacing w:after="160" w:line="259" w:lineRule="auto"/>
+            </w:pPr>
+            <w:r>
+              <w:t>U</w:t>
+            </w:r>
+          </w:p>
+        </w:tc>
+        <w:tc>
+          <w:tcPr>
+            <w:tcW w:w="445" w:type="dxa"/>
+          </w:tcPr>
+          <w:p>
+            <w:pPr>
+              <w:spacing w:after="160" w:line="259" w:lineRule="auto"/>
+            </w:pPr>
+            <w:r>
+              <w:t>V</w:t>
+            </w:r>
+          </w:p>
+        </w:tc>
+        <w:tc>
+          <w:tcPr>
+            <w:tcW w:w="445" w:type="dxa"/>
+          </w:tcPr>
+          <w:p>
+            <w:pPr>
+              <w:spacing w:after="160" w:line="259" w:lineRule="auto"/>
+            </w:pPr>
+            <w:r>
+              <w:t>X</w:t>
+            </w:r>
+          </w:p>
+        </w:tc>
+        <w:tc>
+          <w:tcPr>
+            <w:tcW w:w="445" w:type="dxa"/>
+          </w:tcPr>
+          <w:p>
+            <w:pPr>
+              <w:spacing w:after="160" w:line="259" w:lineRule="auto"/>
+            </w:pPr>
+            <w:r>
+              <w:t>Y</w:t>
+            </w:r>
+          </w:p>
+        </w:tc>
+        <w:tc>
+          <w:tcPr>
+            <w:tcW w:w="445" w:type="dxa"/>
+          </w:tcPr>
+          <w:p>
+            <w:pPr>
+              <w:spacing w:after="160" w:line="259" w:lineRule="auto"/>
+            </w:pPr>
+            <w:r>
+              <w:t>Z</w:t>
+            </w:r>
+          </w:p>
+        </w:tc>
+        <w:tc>
+          <w:tcPr>
+            <w:tcW w:w="445" w:type="dxa"/>
+          </w:tcPr>
+          <w:p/>
+        </w:tc>
+        <w:tc>
+          <w:tcPr>
+            <w:tcW w:w="445" w:type="dxa"/>
+          </w:tcPr>
+          <w:p/>
+        </w:tc>
+      </w:tr>
+    </w:tbl>
+    <w:p>
+      <w:r>
+        <w:tab/>
+      </w:r>
+      <w:r>
+        <w:tab/>
+        <w:t xml:space="preserve">Mensaje: d, </w:t>
+      </w:r>
+      <w:proofErr w:type="spellStart"/>
+      <w:r>
+        <w:t>holamundo</w:t>
+      </w:r>
+      <w:proofErr w:type="spellEnd"/>
+    </w:p>
+    <w:p>
+      <w:r>
+        <w:tab/>
+      </w:r>
+    </w:p>
+    <w:p/>
+    <w:p/>
+    <w:p/>
+    <w:p/>
+    <w:p/>
+    <w:p/>
+    <w:p/>
+    <w:tbl>
+      <w:tblPr>
+        <w:tblStyle w:val="Tablaconcuadrcula"/>
+        <w:tblW w:w="0" w:type="auto"/>
+        <w:tblLook w:val="04A0" w:firstRow="1" w:lastRow="0" w:firstColumn="1" w:lastColumn="0" w:noHBand="0" w:noVBand="1"/>
+      </w:tblPr>
+      <w:tblGrid>
+        <w:gridCol w:w="830"/>
+        <w:gridCol w:w="851"/>
+        <w:gridCol w:w="852"/>
+        <w:gridCol w:w="844"/>
+        <w:gridCol w:w="850"/>
+        <w:gridCol w:w="859"/>
+        <w:gridCol w:w="852"/>
+        <w:gridCol w:w="852"/>
+        <w:gridCol w:w="851"/>
+        <w:gridCol w:w="853"/>
+      </w:tblGrid>
+      <w:tr>
+        <w:tc>
+          <w:tcPr>
+            <w:tcW w:w="830" w:type="dxa"/>
+            <w:shd w:val="clear" w:color="auto" w:fill="92D050"/>
+            <w:vAlign w:val="center"/>
+          </w:tcPr>
+          <w:p>
+            <w:pPr>
+              <w:spacing w:after="160" w:line="259" w:lineRule="auto"/>
+            </w:pPr>
+            <w:r>
+              <w:t>Letra</w:t>
+            </w:r>
+          </w:p>
+        </w:tc>
+        <w:tc>
+          <w:tcPr>
+            <w:tcW w:w="851" w:type="dxa"/>
+            <w:shd w:val="clear" w:color="auto" w:fill="92D050"/>
+            <w:vAlign w:val="center"/>
+          </w:tcPr>
+          <w:p>
+            <w:pPr>
+              <w:spacing w:after="160" w:line="259" w:lineRule="auto"/>
+            </w:pPr>
+            <w:r>
+              <w:t>H</w:t>
+            </w:r>
+          </w:p>
+        </w:tc>
+        <w:tc>
+          <w:tcPr>
+            <w:tcW w:w="852" w:type="dxa"/>
+            <w:shd w:val="clear" w:color="auto" w:fill="92D050"/>
+            <w:vAlign w:val="center"/>
+          </w:tcPr>
+          <w:p>
+            <w:pPr>
+              <w:spacing w:after="160" w:line="259" w:lineRule="auto"/>
+            </w:pPr>
+            <w:r>
+              <w:t>O</w:t>
+            </w:r>
+          </w:p>
+        </w:tc>
+        <w:tc>
+          <w:tcPr>
+            <w:tcW w:w="844" w:type="dxa"/>
+            <w:shd w:val="clear" w:color="auto" w:fill="92D050"/>
+            <w:vAlign w:val="center"/>
+          </w:tcPr>
+          <w:p>
+            <w:pPr>
+              <w:spacing w:after="160" w:line="259" w:lineRule="auto"/>
+            </w:pPr>
+            <w:r>
+              <w:t>L</w:t>
+            </w:r>
+          </w:p>
+        </w:tc>
+        <w:tc>
+          <w:tcPr>
+            <w:tcW w:w="850" w:type="dxa"/>
+            <w:shd w:val="clear" w:color="auto" w:fill="92D050"/>
+            <w:vAlign w:val="center"/>
+          </w:tcPr>
+          <w:p>
+            <w:pPr>
+              <w:spacing w:after="160" w:line="259" w:lineRule="auto"/>
+            </w:pPr>
+            <w:r>
+              <w:t>A</w:t>
+            </w:r>
+          </w:p>
+        </w:tc>
+        <w:tc>
+          <w:tcPr>
+            <w:tcW w:w="859" w:type="dxa"/>
+            <w:shd w:val="clear" w:color="auto" w:fill="92D050"/>
+            <w:vAlign w:val="center"/>
+          </w:tcPr>
+          <w:p>
+            <w:pPr>
+              <w:spacing w:after="160" w:line="259" w:lineRule="auto"/>
+            </w:pPr>
+            <w:r>
+              <w:t>M</w:t>
+            </w:r>
+          </w:p>
+        </w:tc>
+        <w:tc>
+          <w:tcPr>
+            <w:tcW w:w="852" w:type="dxa"/>
+            <w:shd w:val="clear" w:color="auto" w:fill="92D050"/>
+            <w:vAlign w:val="center"/>
+          </w:tcPr>
+          <w:p>
+            <w:pPr>
+              <w:spacing w:after="160" w:line="259" w:lineRule="auto"/>
+            </w:pPr>
+            <w:r>
+              <w:t>U</w:t>
+            </w:r>
+          </w:p>
+        </w:tc>
+        <w:tc>
+          <w:tcPr>
+            <w:tcW w:w="852" w:type="dxa"/>
+            <w:shd w:val="clear" w:color="auto" w:fill="92D050"/>
+            <w:vAlign w:val="center"/>
+          </w:tcPr>
+          <w:p>
+            <w:pPr>
+              <w:spacing w:after="160" w:line="259" w:lineRule="auto"/>
+            </w:pPr>
+            <w:r>
+              <w:t>N</w:t>
+            </w:r>
+          </w:p>
+        </w:tc>
+        <w:tc>
+          <w:tcPr>
+            <w:tcW w:w="851" w:type="dxa"/>
+            <w:shd w:val="clear" w:color="auto" w:fill="92D050"/>
+            <w:vAlign w:val="center"/>
+          </w:tcPr>
+          <w:p>
+            <w:pPr>
+              <w:spacing w:after="160" w:line="259" w:lineRule="auto"/>
+            </w:pPr>
+            <w:r>
+              <w:t>D</w:t>
+            </w:r>
+          </w:p>
+        </w:tc>
+        <w:tc>
+          <w:tcPr>
+            <w:tcW w:w="853" w:type="dxa"/>
+            <w:shd w:val="clear" w:color="auto" w:fill="92D050"/>
+            <w:vAlign w:val="center"/>
+          </w:tcPr>
+          <w:p>
+            <w:pPr>
+              <w:spacing w:after="160" w:line="259" w:lineRule="auto"/>
+            </w:pPr>
+            <w:r>
+              <w:t>O</w:t>
+            </w:r>
+          </w:p>
+        </w:tc>
+      </w:tr>
+      <w:tr>
+        <w:tc>
+          <w:tcPr>
+            <w:tcW w:w="830" w:type="dxa"/>
+            <w:shd w:val="clear" w:color="auto" w:fill="92D050"/>
+            <w:vAlign w:val="center"/>
+          </w:tcPr>
+          <w:p>
+            <w:pPr>
+              <w:spacing w:after="160" w:line="259" w:lineRule="auto"/>
+            </w:pPr>
+            <w:r>
+              <w:t>Fil</w:t>
+            </w:r>
+          </w:p>
+        </w:tc>
+        <w:tc>
+          <w:tcPr>
+            <w:tcW w:w="851" w:type="dxa"/>
+            <w:shd w:val="clear" w:color="auto" w:fill="92D050"/>
+            <w:vAlign w:val="center"/>
+          </w:tcPr>
+          <w:p>
+            <w:pPr>
+              <w:spacing w:after="160" w:line="259" w:lineRule="auto"/>
+            </w:pPr>
+            <w:r>
+              <w:t>1</w:t>
+            </w:r>
+          </w:p>
+        </w:tc>
+        <w:tc>
+          <w:tcPr>
+            <w:tcW w:w="852" w:type="dxa"/>
+            <w:shd w:val="clear" w:color="auto" w:fill="92D050"/>
+            <w:vAlign w:val="center"/>
+          </w:tcPr>
+          <w:p>
+            <w:pPr>
+              <w:spacing w:after="160" w:line="259" w:lineRule="auto"/>
+            </w:pPr>
+            <w:r>
+              <w:t>2</w:t>
+            </w:r>
+          </w:p>
+        </w:tc>
+        <w:tc>
+          <w:tcPr>
+            <w:tcW w:w="844" w:type="dxa"/>
+            <w:shd w:val="clear" w:color="auto" w:fill="92D050"/>
+            <w:vAlign w:val="center"/>
+          </w:tcPr>
+          <w:p>
+            <w:pPr>
+              <w:spacing w:after="160" w:line="259" w:lineRule="auto"/>
+            </w:pPr>
+            <w:r>
+              <w:t>2</w:t>
+            </w:r>
+          </w:p>
+        </w:tc>
+        <w:tc>
+          <w:tcPr>
+            <w:tcW w:w="850" w:type="dxa"/>
+            <w:shd w:val="clear" w:color="auto" w:fill="92D050"/>
+            <w:vAlign w:val="center"/>
+          </w:tcPr>
+          <w:p>
+            <w:pPr>
+              <w:spacing w:after="160" w:line="259" w:lineRule="auto"/>
+            </w:pPr>
+            <w:r>
+              <w:t>0</w:t>
+            </w:r>
+          </w:p>
+        </w:tc>
+        <w:tc>
+          <w:tcPr>
+            <w:tcW w:w="859" w:type="dxa"/>
+            <w:shd w:val="clear" w:color="auto" w:fill="92D050"/>
+            <w:vAlign w:val="center"/>
+          </w:tcPr>
+          <w:p>
+            <w:pPr>
+              <w:spacing w:after="160" w:line="259" w:lineRule="auto"/>
+            </w:pPr>
+            <w:r>
+              <w:t>2</w:t>
+            </w:r>
+          </w:p>
+        </w:tc>
+        <w:tc>
+          <w:tcPr>
+            <w:tcW w:w="852" w:type="dxa"/>
+            <w:shd w:val="clear" w:color="auto" w:fill="92D050"/>
+            <w:vAlign w:val="center"/>
+          </w:tcPr>
+          <w:p>
+            <w:pPr>
+              <w:spacing w:after="160" w:line="259" w:lineRule="auto"/>
+            </w:pPr>
+            <w:r>
+              <w:t>4</w:t>
+            </w:r>
+          </w:p>
+        </w:tc>
+        <w:tc>
+          <w:tcPr>
+            <w:tcW w:w="852" w:type="dxa"/>
+            <w:shd w:val="clear" w:color="auto" w:fill="92D050"/>
+            <w:vAlign w:val="center"/>
+          </w:tcPr>
+          <w:p>
+            <w:pPr>
+              <w:spacing w:after="160" w:line="259" w:lineRule="auto"/>
+            </w:pPr>
+            <w:r>
+              <w:t>2</w:t>
+            </w:r>
+          </w:p>
+        </w:tc>
+        <w:tc>
+          <w:tcPr>
+            <w:tcW w:w="851" w:type="dxa"/>
+            <w:shd w:val="clear" w:color="auto" w:fill="92D050"/>
+            <w:vAlign w:val="center"/>
+          </w:tcPr>
+          <w:p>
+            <w:pPr>
+              <w:spacing w:after="160" w:line="259" w:lineRule="auto"/>
+            </w:pPr>
+            <w:r>
+              <w:t>0</w:t>
+            </w:r>
+          </w:p>
+        </w:tc>
+        <w:tc>
+          <w:tcPr>
+            <w:tcW w:w="853" w:type="dxa"/>
+            <w:shd w:val="clear" w:color="auto" w:fill="92D050"/>
+            <w:vAlign w:val="center"/>
+          </w:tcPr>
+          <w:p>
+            <w:pPr>
+              <w:spacing w:after="160" w:line="259" w:lineRule="auto"/>
+            </w:pPr>
+            <w:r>
+              <w:t>2</w:t>
+            </w:r>
+          </w:p>
+        </w:tc>
+      </w:tr>
+      <w:tr>
+        <w:tc>
+          <w:tcPr>
+            <w:tcW w:w="830" w:type="dxa"/>
+            <w:shd w:val="clear" w:color="auto" w:fill="92D050"/>
+            <w:vAlign w:val="center"/>
+          </w:tcPr>
+          <w:p>
+            <w:pPr>
+              <w:spacing w:after="160" w:line="259" w:lineRule="auto"/>
+            </w:pPr>
+            <w:r>
+              <w:t>col</w:t>
+            </w:r>
+          </w:p>
+        </w:tc>
+        <w:tc>
+          <w:tcPr>
+            <w:tcW w:w="851" w:type="dxa"/>
+            <w:shd w:val="clear" w:color="auto" w:fill="92D050"/>
+            <w:vAlign w:val="center"/>
+          </w:tcPr>
+          <w:p>
+            <w:pPr>
+              <w:spacing w:after="160" w:line="259" w:lineRule="auto"/>
+            </w:pPr>
+            <w:r>
+              <w:t>2</w:t>
+            </w:r>
+          </w:p>
+        </w:tc>
+        <w:tc>
+          <w:tcPr>
+            <w:tcW w:w="852" w:type="dxa"/>
+            <w:shd w:val="clear" w:color="auto" w:fill="92D050"/>
+            <w:vAlign w:val="center"/>
+          </w:tcPr>
+          <w:p>
+            <w:pPr>
+              <w:spacing w:after="160" w:line="259" w:lineRule="auto"/>
+            </w:pPr>
+            <w:r>
+              <w:t>4</w:t>
+            </w:r>
+          </w:p>
+        </w:tc>
+        <w:tc>
+          <w:tcPr>
+            <w:tcW w:w="844" w:type="dxa"/>
+            <w:shd w:val="clear" w:color="auto" w:fill="92D050"/>
+            <w:vAlign w:val="center"/>
+          </w:tcPr>
+          <w:p>
+            <w:pPr>
+              <w:spacing w:after="160" w:line="259" w:lineRule="auto"/>
+            </w:pPr>
+            <w:r>
+              <w:t>1</w:t>
+            </w:r>
+          </w:p>
+        </w:tc>
+        <w:tc>
+          <w:tcPr>
+            <w:tcW w:w="850" w:type="dxa"/>
+            <w:shd w:val="clear" w:color="auto" w:fill="92D050"/>
+            <w:vAlign w:val="center"/>
+          </w:tcPr>
+          <w:p>
+            <w:pPr>
+              <w:spacing w:after="160" w:line="259" w:lineRule="auto"/>
+            </w:pPr>
+            <w:r>
+              <w:t>0</w:t>
+            </w:r>
+          </w:p>
+        </w:tc>
+        <w:tc>
+          <w:tcPr>
+            <w:tcW w:w="859" w:type="dxa"/>
+            <w:shd w:val="clear" w:color="auto" w:fill="92D050"/>
+            <w:vAlign w:val="center"/>
+          </w:tcPr>
+          <w:p>
+            <w:pPr>
+              <w:spacing w:after="160" w:line="259" w:lineRule="auto"/>
+            </w:pPr>
+            <w:r>
+              <w:t>2</w:t>
+            </w:r>
+          </w:p>
+        </w:tc>
+        <w:tc>
+          <w:tcPr>
+            <w:tcW w:w="852" w:type="dxa"/>
+            <w:shd w:val="clear" w:color="auto" w:fill="92D050"/>
+            <w:vAlign w:val="center"/>
+          </w:tcPr>
+          <w:p>
+            <w:pPr>
+              <w:spacing w:after="160" w:line="259" w:lineRule="auto"/>
+            </w:pPr>
+            <w:r>
+              <w:t>0</w:t>
+            </w:r>
+          </w:p>
+        </w:tc>
+        <w:tc>
+          <w:tcPr>
+            <w:tcW w:w="852" w:type="dxa"/>
+            <w:shd w:val="clear" w:color="auto" w:fill="92D050"/>
+            <w:vAlign w:val="center"/>
+          </w:tcPr>
+          <w:p>
+            <w:pPr>
+              <w:spacing w:after="160" w:line="259" w:lineRule="auto"/>
+            </w:pPr>
+            <w:r>
+              <w:t>3</w:t>
+            </w:r>
+          </w:p>
+        </w:tc>
+        <w:tc>
+          <w:tcPr>
+            <w:tcW w:w="851" w:type="dxa"/>
+            <w:shd w:val="clear" w:color="auto" w:fill="92D050"/>
+            <w:vAlign w:val="center"/>
+          </w:tcPr>
+          <w:p>
+            <w:pPr>
+              <w:spacing w:after="160" w:line="259" w:lineRule="auto"/>
+            </w:pPr>
+            <w:r>
+              <w:t>3</w:t>
+            </w:r>
+          </w:p>
+        </w:tc>
+        <w:tc>
+          <w:tcPr>
+            <w:tcW w:w="853" w:type="dxa"/>
+            <w:shd w:val="clear" w:color="auto" w:fill="92D050"/>
+            <w:vAlign w:val="center"/>
+          </w:tcPr>
+          <w:p>
+            <w:pPr>
+              <w:spacing w:after="160" w:line="259" w:lineRule="auto"/>
+            </w:pPr>
+            <w:r>
+              <w:t>4</w:t>
+            </w:r>
+          </w:p>
+        </w:tc>
+      </w:tr>
+    </w:tbl>
+    <w:p>
+      <w:r>
+        <w:br/>
+      </w:r>
+    </w:p>
+    <w:tbl>
+      <w:tblPr>
+        <w:tblStyle w:val="Tablaconcuadrcula"/>
+        <w:tblW w:w="0" w:type="auto"/>
+        <w:tblLook w:val="04A0" w:firstRow="1" w:lastRow="0" w:firstColumn="1" w:lastColumn="0" w:noHBand="0" w:noVBand="1"/>
+      </w:tblPr>
+      <w:tblGrid>
+        <w:gridCol w:w="821"/>
+        <w:gridCol w:w="770"/>
+        <w:gridCol w:w="765"/>
+        <w:gridCol w:w="763"/>
+        <w:gridCol w:w="763"/>
+        <w:gridCol w:w="749"/>
+        <w:gridCol w:w="778"/>
+        <w:gridCol w:w="771"/>
+        <w:gridCol w:w="772"/>
+        <w:gridCol w:w="770"/>
+        <w:gridCol w:w="772"/>
+      </w:tblGrid>
+      <w:tr>
+        <w:tc>
+          <w:tcPr>
+            <w:tcW w:w="821" w:type="dxa"/>
+            <w:vAlign w:val="center"/>
+          </w:tcPr>
+          <w:p>
+            <w:pPr>
+              <w:spacing w:after="160" w:line="259" w:lineRule="auto"/>
+            </w:pPr>
+            <w:r>
+              <w:t>Letra</w:t>
+            </w:r>
+          </w:p>
+        </w:tc>
+        <w:tc>
+          <w:tcPr>
+            <w:tcW w:w="770" w:type="dxa"/>
+            <w:vAlign w:val="center"/>
+          </w:tcPr>
+          <w:p>
+            <w:pPr>
+              <w:spacing w:after="160" w:line="259" w:lineRule="auto"/>
+            </w:pPr>
+            <w:r>
+              <w:t>H</w:t>
+            </w:r>
+          </w:p>
+        </w:tc>
+        <w:tc>
+          <w:tcPr>
+            <w:tcW w:w="765" w:type="dxa"/>
+            <w:vAlign w:val="center"/>
+          </w:tcPr>
+          <w:p>
+            <w:pPr>
+              <w:spacing w:after="160" w:line="259" w:lineRule="auto"/>
+            </w:pPr>
+            <w:r>
+              <w:t>E</w:t>
+            </w:r>
+          </w:p>
+        </w:tc>
+        <w:tc>
+          <w:tcPr>
+            <w:tcW w:w="763" w:type="dxa"/>
+            <w:vAlign w:val="center"/>
+          </w:tcPr>
+          <w:p>
+            <w:pPr>
+              <w:spacing w:after="160" w:line="259" w:lineRule="auto"/>
+            </w:pPr>
+            <w:r>
+              <w:t>L</w:t>
+            </w:r>
+          </w:p>
+        </w:tc>
+        <w:tc>
+          <w:tcPr>
+            <w:tcW w:w="763" w:type="dxa"/>
+            <w:vAlign w:val="center"/>
+          </w:tcPr>
+          <w:p>
+            <w:pPr>
+              <w:spacing w:after="160" w:line="259" w:lineRule="auto"/>
+            </w:pPr>
+            <w:r>
+              <w:t>L</w:t>
+            </w:r>
+          </w:p>
+        </w:tc>
+        <w:tc>
+          <w:tcPr>
+            <w:tcW w:w="749" w:type="dxa"/>
+            <w:vAlign w:val="center"/>
+          </w:tcPr>
+          <w:p>
+            <w:pPr>
+              <w:spacing w:after="160" w:line="259" w:lineRule="auto"/>
+            </w:pPr>
+            <w:r>
+              <w:t>O</w:t>
+            </w:r>
+          </w:p>
+        </w:tc>
+        <w:tc>
+          <w:tcPr>
+            <w:tcW w:w="778" w:type="dxa"/>
+            <w:vAlign w:val="center"/>
+          </w:tcPr>
+          <w:p>
+            <w:pPr>
+              <w:spacing w:after="160" w:line="259" w:lineRule="auto"/>
+            </w:pPr>
+            <w:r>
+              <w:t>M</w:t>
+            </w:r>
+          </w:p>
+        </w:tc>
+        <w:tc>
+          <w:tcPr>
+            <w:tcW w:w="771" w:type="dxa"/>
+            <w:vAlign w:val="center"/>
+          </w:tcPr>
+          <w:p>
+            <w:pPr>
+              <w:spacing w:after="160" w:line="259" w:lineRule="auto"/>
+            </w:pPr>
+            <w:r>
+              <w:t>U</w:t>
+            </w:r>
+          </w:p>
+        </w:tc>
+        <w:tc>
+          <w:tcPr>
+            <w:tcW w:w="772" w:type="dxa"/>
+            <w:vAlign w:val="center"/>
+          </w:tcPr>
+          <w:p>
+            <w:pPr>
+              <w:spacing w:after="160" w:line="259" w:lineRule="auto"/>
+            </w:pPr>
+            <w:r>
+              <w:t>N</w:t>
+            </w:r>
+          </w:p>
+        </w:tc>
+        <w:tc>
+          <w:tcPr>
+            <w:tcW w:w="770" w:type="dxa"/>
+            <w:vAlign w:val="center"/>
+          </w:tcPr>
+          <w:p>
+            <w:pPr>
+              <w:spacing w:after="160" w:line="259" w:lineRule="auto"/>
+            </w:pPr>
+            <w:r>
+              <w:t>D</w:t>
+            </w:r>
+          </w:p>
+        </w:tc>
+        <w:tc>
+          <w:tcPr>
+            <w:tcW w:w="772" w:type="dxa"/>
+            <w:vAlign w:val="center"/>
+          </w:tcPr>
+          <w:p>
+            <w:pPr>
+              <w:spacing w:after="160" w:line="259" w:lineRule="auto"/>
+            </w:pPr>
+            <w:r>
+              <w:t>O</w:t>
+            </w:r>
+          </w:p>
+        </w:tc>
+      </w:tr>
+      <w:tr>
+        <w:tc>
+          <w:tcPr>
+            <w:tcW w:w="821" w:type="dxa"/>
+            <w:vAlign w:val="center"/>
+          </w:tcPr>
+          <w:p>
+            <w:pPr>
+              <w:spacing w:after="160" w:line="259" w:lineRule="auto"/>
+            </w:pPr>
+            <w:r>
+              <w:t>Fil</w:t>
+            </w:r>
+          </w:p>
+        </w:tc>
+        <w:tc>
+          <w:tcPr>
+            <w:tcW w:w="770" w:type="dxa"/>
+            <w:vAlign w:val="center"/>
+          </w:tcPr>
+          <w:p>
+            <w:pPr>
+              <w:spacing w:after="160" w:line="259" w:lineRule="auto"/>
+            </w:pPr>
+            <w:r>
+              <w:t>1</w:t>
+            </w:r>
+          </w:p>
+        </w:tc>
+        <w:tc>
+          <w:tcPr>
+            <w:tcW w:w="765" w:type="dxa"/>
+            <w:vAlign w:val="center"/>
+          </w:tcPr>
+          <w:p>
+            <w:pPr>
+              <w:spacing w:after="160" w:line="259" w:lineRule="auto"/>
+            </w:pPr>
+            <w:r>
+              <w:t>0</w:t>
+            </w:r>
+          </w:p>
+        </w:tc>
+        <w:tc>
+          <w:tcPr>
+            <w:tcW w:w="763" w:type="dxa"/>
+            <w:vAlign w:val="center"/>
+          </w:tcPr>
+          <w:p>
+            <w:pPr>
+              <w:spacing w:after="160" w:line="259" w:lineRule="auto"/>
+            </w:pPr>
+            <w:r>
+              <w:t>2</w:t>
+            </w:r>
+          </w:p>
+        </w:tc>
+        <w:tc>
+          <w:tcPr>
+            <w:tcW w:w="763" w:type="dxa"/>
+            <w:vAlign w:val="center"/>
+          </w:tcPr>
+          <w:p>
+            <w:pPr>
+              <w:spacing w:after="160" w:line="259" w:lineRule="auto"/>
+            </w:pPr>
+            <w:r>
+              <w:t>2</w:t>
+            </w:r>
+          </w:p>
+        </w:tc>
+        <w:tc>
+          <w:tcPr>
+            <w:tcW w:w="749" w:type="dxa"/>
+            <w:vAlign w:val="center"/>
+          </w:tcPr>
+          <w:p>
+            <w:pPr>
+              <w:spacing w:after="160" w:line="259" w:lineRule="auto"/>
+            </w:pPr>
+            <w:r>
+              <w:t>2</w:t>
+            </w:r>
+          </w:p>
+        </w:tc>
+        <w:tc>
+          <w:tcPr>
+            <w:tcW w:w="778" w:type="dxa"/>
+            <w:vAlign w:val="center"/>
+          </w:tcPr>
+          <w:p>
+            <w:pPr>
+              <w:spacing w:after="160" w:line="259" w:lineRule="auto"/>
+            </w:pPr>
+            <w:r>
+              <w:t>2</w:t>
+            </w:r>
+          </w:p>
+        </w:tc>
+        <w:tc>
+          <w:tcPr>
+            <w:tcW w:w="771" w:type="dxa"/>
+            <w:vAlign w:val="center"/>
+          </w:tcPr>
+          <w:p>
+            <w:pPr>
+              <w:spacing w:after="160" w:line="259" w:lineRule="auto"/>
+            </w:pPr>
+            <w:r>
+              <w:t>4</w:t>
+            </w:r>
+          </w:p>
+        </w:tc>
+        <w:tc>
+          <w:tcPr>
+            <w:tcW w:w="772" w:type="dxa"/>
+            <w:vAlign w:val="center"/>
+          </w:tcPr>
+          <w:p>
+            <w:pPr>
+              <w:spacing w:after="160" w:line="259" w:lineRule="auto"/>
+            </w:pPr>
+            <w:r>
+              <w:t>2</w:t>
+            </w:r>
+          </w:p>
+        </w:tc>
+        <w:tc>
+          <w:tcPr>
+            <w:tcW w:w="770" w:type="dxa"/>
+            <w:vAlign w:val="center"/>
+          </w:tcPr>
+          <w:p>
+            <w:pPr>
+              <w:spacing w:after="160" w:line="259" w:lineRule="auto"/>
+            </w:pPr>
+            <w:r>
+              <w:t>0</w:t>
+            </w:r>
+          </w:p>
+        </w:tc>
+        <w:tc>
+          <w:tcPr>
+            <w:tcW w:w="772" w:type="dxa"/>
+            <w:vAlign w:val="center"/>
+          </w:tcPr>
+          <w:p>
+            <w:pPr>
+              <w:spacing w:after="160" w:line="259" w:lineRule="auto"/>
+            </w:pPr>
+            <w:r>
+              <w:t>2</w:t>
+            </w:r>
+          </w:p>
+        </w:tc>
+      </w:tr>
+      <w:tr>
+        <w:tc>
+          <w:tcPr>
+            <w:tcW w:w="821" w:type="dxa"/>
+            <w:vAlign w:val="center"/>
+          </w:tcPr>
+          <w:p>
+            <w:pPr>
+              <w:spacing w:after="160" w:line="259" w:lineRule="auto"/>
+            </w:pPr>
+            <w:r>
+              <w:t>col</w:t>
+            </w:r>
+          </w:p>
+        </w:tc>
+        <w:tc>
+          <w:tcPr>
+            <w:tcW w:w="770" w:type="dxa"/>
+            <w:vAlign w:val="center"/>
+          </w:tcPr>
+          <w:p>
+            <w:pPr>
+              <w:spacing w:after="160" w:line="259" w:lineRule="auto"/>
+            </w:pPr>
+            <w:r>
+              <w:t>2</w:t>
+            </w:r>
+          </w:p>
+        </w:tc>
+        <w:tc>
+          <w:tcPr>
+            <w:tcW w:w="765" w:type="dxa"/>
+            <w:vAlign w:val="center"/>
+          </w:tcPr>
+          <w:p>
+            <w:pPr>
+              <w:spacing w:after="160" w:line="259" w:lineRule="auto"/>
+            </w:pPr>
+            <w:r>
+              <w:t>4</w:t>
+            </w:r>
+          </w:p>
+        </w:tc>
+        <w:tc>
+          <w:tcPr>
+            <w:tcW w:w="763" w:type="dxa"/>
+            <w:vAlign w:val="center"/>
+          </w:tcPr>
+          <w:p>
+            <w:pPr>
+              <w:spacing w:after="160" w:line="259" w:lineRule="auto"/>
+            </w:pPr>
+            <w:r>
+              <w:t>1</w:t>
+            </w:r>
+          </w:p>
+        </w:tc>
+        <w:tc>
+          <w:tcPr>
+            <w:tcW w:w="763" w:type="dxa"/>
+            <w:vAlign w:val="center"/>
+          </w:tcPr>
+          <w:p>
+            <w:pPr>
+              <w:spacing w:after="160" w:line="259" w:lineRule="auto"/>
+            </w:pPr>
+            <w:r>
+              <w:t>1</w:t>
+            </w:r>
+          </w:p>
+        </w:tc>
+        <w:tc>
+          <w:tcPr>
+            <w:tcW w:w="749" w:type="dxa"/>
+            <w:vAlign w:val="center"/>
+          </w:tcPr>
+          <w:p>
+            <w:pPr>
+              <w:spacing w:after="160" w:line="259" w:lineRule="auto"/>
+            </w:pPr>
+            <w:r>
+              <w:t>4</w:t>
+            </w:r>
+          </w:p>
+        </w:tc>
+        <w:tc>
+          <w:tcPr>
+            <w:tcW w:w="778" w:type="dxa"/>
+            <w:vAlign w:val="center"/>
+          </w:tcPr>
+          <w:p>
+            <w:pPr>
+              <w:spacing w:after="160" w:line="259" w:lineRule="auto"/>
+            </w:pPr>
+            <w:r>
+              <w:t>2</w:t>
+            </w:r>
+          </w:p>
+        </w:tc>
+        <w:tc>
+          <w:tcPr>
+            <w:tcW w:w="771" w:type="dxa"/>
+            <w:vAlign w:val="center"/>
+          </w:tcPr>
+          <w:p>
+            <w:pPr>
+              <w:spacing w:after="160" w:line="259" w:lineRule="auto"/>
+            </w:pPr>
+            <w:r>
+              <w:t>0</w:t>
+            </w:r>
+          </w:p>
+        </w:tc>
+        <w:tc>
+          <w:tcPr>
+            <w:tcW w:w="772" w:type="dxa"/>
+            <w:vAlign w:val="center"/>
+          </w:tcPr>
+          <w:p>
+            <w:pPr>
+              <w:spacing w:after="160" w:line="259" w:lineRule="auto"/>
+            </w:pPr>
+            <w:r>
+              <w:t>3</w:t>
+            </w:r>
+          </w:p>
+        </w:tc>
+        <w:tc>
+          <w:tcPr>
+            <w:tcW w:w="770" w:type="dxa"/>
+            <w:vAlign w:val="center"/>
+          </w:tcPr>
+          <w:p>
+            <w:pPr>
+              <w:spacing w:after="160" w:line="259" w:lineRule="auto"/>
+            </w:pPr>
+            <w:r>
+              <w:t>3</w:t>
+            </w:r>
+          </w:p>
+        </w:tc>
+        <w:tc>
+          <w:tcPr>
+            <w:tcW w:w="772" w:type="dxa"/>
+            <w:vAlign w:val="center"/>
+          </w:tcPr>
+          <w:p>
+            <w:pPr>
+              <w:spacing w:after="160" w:line="259" w:lineRule="auto"/>
+            </w:pPr>
+            <w:r>
+              <w:t>4</w:t>
+            </w:r>
+          </w:p>
+        </w:tc>
+      </w:tr>
+    </w:tbl>
+    <w:p/>
+    <w:tbl>
+      <w:tblPr>
+        <w:tblStyle w:val="Tablaconcuadrcula"/>
+        <w:tblW w:w="0" w:type="auto"/>
+        <w:tblLook w:val="04A0" w:firstRow="1" w:lastRow="0" w:firstColumn="1" w:lastColumn="0" w:noHBand="0" w:noVBand="1"/>
+      </w:tblPr>
+      <w:tblGrid>
+        <w:gridCol w:w="943"/>
+        <w:gridCol w:w="943"/>
+        <w:gridCol w:w="944"/>
+        <w:gridCol w:w="944"/>
+        <w:gridCol w:w="944"/>
+        <w:gridCol w:w="944"/>
+        <w:gridCol w:w="944"/>
+        <w:gridCol w:w="944"/>
+        <w:gridCol w:w="944"/>
+      </w:tblGrid>
+      <w:tr>
+        <w:tc>
+          <w:tcPr>
+            <w:tcW w:w="943" w:type="dxa"/>
+            <w:shd w:val="clear" w:color="auto" w:fill="92D050"/>
+            <w:vAlign w:val="center"/>
+          </w:tcPr>
+          <w:p>
+            <w:pPr>
+              <w:spacing w:after="160" w:line="259" w:lineRule="auto"/>
+            </w:pPr>
+            <w:r>
+              <w:t>1</w:t>
+            </w:r>
+          </w:p>
+        </w:tc>
+        <w:tc>
+          <w:tcPr>
+            <w:tcW w:w="943" w:type="dxa"/>
+            <w:shd w:val="clear" w:color="auto" w:fill="92D050"/>
+            <w:vAlign w:val="center"/>
+          </w:tcPr>
+          <w:p>
+            <w:pPr>
+              <w:spacing w:after="160" w:line="259" w:lineRule="auto"/>
+            </w:pPr>
+            <w:r>
+              <w:t>2</w:t>
+            </w:r>
+          </w:p>
+        </w:tc>
+        <w:tc>
+          <w:tcPr>
+            <w:tcW w:w="944" w:type="dxa"/>
+            <w:shd w:val="clear" w:color="auto" w:fill="92D050"/>
+            <w:vAlign w:val="center"/>
+          </w:tcPr>
+          <w:p>
+            <w:pPr>
+              <w:spacing w:after="160" w:line="259" w:lineRule="auto"/>
+            </w:pPr>
+            <w:r>
+              <w:t>2</w:t>
+            </w:r>
+          </w:p>
+        </w:tc>
+        <w:tc>
+          <w:tcPr>
+            <w:tcW w:w="944" w:type="dxa"/>
+            <w:shd w:val="clear" w:color="auto" w:fill="92D050"/>
+            <w:vAlign w:val="center"/>
+          </w:tcPr>
+          <w:p>
+            <w:pPr>
+              <w:spacing w:after="160" w:line="259" w:lineRule="auto"/>
+            </w:pPr>
+            <w:r>
+              <w:t>4</w:t>
+            </w:r>
+          </w:p>
+        </w:tc>
+        <w:tc>
+          <w:tcPr>
+            <w:tcW w:w="944" w:type="dxa"/>
+            <w:shd w:val="clear" w:color="auto" w:fill="92D050"/>
+            <w:vAlign w:val="center"/>
+          </w:tcPr>
+          <w:p>
+            <w:pPr>
+              <w:spacing w:after="160" w:line="259" w:lineRule="auto"/>
+            </w:pPr>
+            <w:r>
+              <w:t>2</w:t>
+            </w:r>
+          </w:p>
+        </w:tc>
+        <w:tc>
+          <w:tcPr>
+            <w:tcW w:w="944" w:type="dxa"/>
+            <w:shd w:val="clear" w:color="auto" w:fill="92D050"/>
+            <w:vAlign w:val="center"/>
+          </w:tcPr>
+          <w:p>
+            <w:pPr>
+              <w:spacing w:after="160" w:line="259" w:lineRule="auto"/>
+            </w:pPr>
+            <w:r>
+              <w:t>1</w:t>
+            </w:r>
+          </w:p>
+        </w:tc>
+        <w:tc>
+          <w:tcPr>
+            <w:tcW w:w="944" w:type="dxa"/>
+            <w:shd w:val="clear" w:color="auto" w:fill="92D050"/>
+            <w:vAlign w:val="center"/>
+          </w:tcPr>
+          <w:p>
+            <w:pPr>
+              <w:spacing w:after="160" w:line="259" w:lineRule="auto"/>
+            </w:pPr>
+            <w:r>
+              <w:t>0</w:t>
+            </w:r>
+          </w:p>
+        </w:tc>
+        <w:tc>
+          <w:tcPr>
+            <w:tcW w:w="944" w:type="dxa"/>
+            <w:shd w:val="clear" w:color="auto" w:fill="92D050"/>
+            <w:vAlign w:val="center"/>
+          </w:tcPr>
+          <w:p>
+            <w:pPr>
+              <w:spacing w:after="160" w:line="259" w:lineRule="auto"/>
+            </w:pPr>
+            <w:r>
+              <w:t>0</w:t>
+            </w:r>
+          </w:p>
+        </w:tc>
+        <w:tc>
+          <w:tcPr>
+            <w:tcW w:w="944" w:type="dxa"/>
+            <w:shd w:val="clear" w:color="auto" w:fill="92D050"/>
+            <w:vAlign w:val="center"/>
+          </w:tcPr>
+          <w:p>
+            <w:pPr>
+              <w:spacing w:after="160" w:line="259" w:lineRule="auto"/>
+            </w:pPr>
+            <w:r>
+              <w:t>2</w:t>
+            </w:r>
+          </w:p>
+        </w:tc>
+      </w:tr>
+      <w:tr>
+        <w:tc>
+          <w:tcPr>
+            <w:tcW w:w="943" w:type="dxa"/>
+            <w:shd w:val="clear" w:color="auto" w:fill="92D050"/>
+            <w:vAlign w:val="center"/>
+          </w:tcPr>
+          <w:p>
+            <w:pPr>
+              <w:spacing w:after="160" w:line="259" w:lineRule="auto"/>
+            </w:pPr>
+            <w:r>
+              <w:t>2</w:t>
+            </w:r>
+          </w:p>
+        </w:tc>
+        <w:tc>
+          <w:tcPr>
+            <w:tcW w:w="943" w:type="dxa"/>
+            <w:shd w:val="clear" w:color="auto" w:fill="92D050"/>
+            <w:vAlign w:val="center"/>
+          </w:tcPr>
+          <w:p>
+            <w:pPr>
+              <w:spacing w:after="160" w:line="259" w:lineRule="auto"/>
+            </w:pPr>
+            <w:r>
+              <w:t>4</w:t>
+            </w:r>
+          </w:p>
+        </w:tc>
+        <w:tc>
+          <w:tcPr>
+            <w:tcW w:w="944" w:type="dxa"/>
+            <w:shd w:val="clear" w:color="auto" w:fill="92D050"/>
+            <w:vAlign w:val="center"/>
+          </w:tcPr>
+          <w:p>
+            <w:pPr>
+              <w:spacing w:after="160" w:line="259" w:lineRule="auto"/>
+            </w:pPr>
+            <w:r>
+              <w:t>0</w:t>
+            </w:r>
+          </w:p>
+        </w:tc>
+        <w:tc>
+          <w:tcPr>
+            <w:tcW w:w="944" w:type="dxa"/>
+            <w:shd w:val="clear" w:color="auto" w:fill="92D050"/>
+            <w:vAlign w:val="center"/>
+          </w:tcPr>
+          <w:p>
+            <w:pPr>
+              <w:spacing w:after="160" w:line="259" w:lineRule="auto"/>
+            </w:pPr>
+            <w:r>
+              <w:t>2</w:t>
+            </w:r>
+          </w:p>
+        </w:tc>
+        <w:tc>
+          <w:tcPr>
+            <w:tcW w:w="944" w:type="dxa"/>
+            <w:shd w:val="clear" w:color="auto" w:fill="92D050"/>
+            <w:vAlign w:val="center"/>
+          </w:tcPr>
+          <w:p>
+            <w:pPr>
+              <w:spacing w:after="160" w:line="259" w:lineRule="auto"/>
+            </w:pPr>
+            <w:r>
+              <w:t>3</w:t>
+            </w:r>
+          </w:p>
+        </w:tc>
+        <w:tc>
+          <w:tcPr>
+            <w:tcW w:w="944" w:type="dxa"/>
+            <w:shd w:val="clear" w:color="auto" w:fill="92D050"/>
+            <w:vAlign w:val="center"/>
+          </w:tcPr>
+          <w:p>
+            <w:pPr>
+              <w:spacing w:after="160" w:line="259" w:lineRule="auto"/>
+            </w:pPr>
+            <w:r>
+              <w:t>0</w:t>
+            </w:r>
+          </w:p>
+        </w:tc>
+        <w:tc>
+          <w:tcPr>
+            <w:tcW w:w="944" w:type="dxa"/>
+            <w:shd w:val="clear" w:color="auto" w:fill="92D050"/>
+            <w:vAlign w:val="center"/>
+          </w:tcPr>
+          <w:p>
+            <w:pPr>
+              <w:spacing w:after="160" w:line="259" w:lineRule="auto"/>
+            </w:pPr>
+            <w:r>
+              <w:t>3</w:t>
+            </w:r>
+          </w:p>
+        </w:tc>
+        <w:tc>
+          <w:tcPr>
+            <w:tcW w:w="944" w:type="dxa"/>
+            <w:shd w:val="clear" w:color="auto" w:fill="92D050"/>
+            <w:vAlign w:val="center"/>
+          </w:tcPr>
+          <w:p>
+            <w:pPr>
+              <w:spacing w:after="160" w:line="259" w:lineRule="auto"/>
+            </w:pPr>
+            <w:r>
+              <w:t>2</w:t>
+            </w:r>
+          </w:p>
+        </w:tc>
+        <w:tc>
+          <w:tcPr>
+            <w:tcW w:w="944" w:type="dxa"/>
+            <w:shd w:val="clear" w:color="auto" w:fill="92D050"/>
+            <w:vAlign w:val="center"/>
+          </w:tcPr>
+          <w:p>
+            <w:pPr>
+              <w:spacing w:after="160" w:line="259" w:lineRule="auto"/>
+            </w:pPr>
+            <w:r>
+              <w:t>4</w:t>
+            </w:r>
+          </w:p>
+        </w:tc>
+      </w:tr>
+      <w:tr>
+        <w:tc>
+          <w:tcPr>
+            <w:tcW w:w="943" w:type="dxa"/>
+            <w:shd w:val="clear" w:color="auto" w:fill="92D050"/>
+            <w:vAlign w:val="center"/>
+          </w:tcPr>
+          <w:p>
+            <w:pPr>
+              <w:spacing w:after="160" w:line="259" w:lineRule="auto"/>
+            </w:pPr>
+            <w:r>
+              <w:t>H</w:t>
+            </w:r>
+          </w:p>
+        </w:tc>
+        <w:tc>
+          <w:tcPr>
+            <w:tcW w:w="943" w:type="dxa"/>
+            <w:shd w:val="clear" w:color="auto" w:fill="92D050"/>
+            <w:vAlign w:val="center"/>
+          </w:tcPr>
+          <w:p>
+            <w:pPr>
+              <w:spacing w:after="160" w:line="259" w:lineRule="auto"/>
+            </w:pPr>
+            <w:r>
+              <w:t>O</w:t>
+            </w:r>
+          </w:p>
+        </w:tc>
+        <w:tc>
+          <w:tcPr>
+            <w:tcW w:w="944" w:type="dxa"/>
+            <w:shd w:val="clear" w:color="auto" w:fill="92D050"/>
+            <w:vAlign w:val="center"/>
+          </w:tcPr>
+          <w:p>
+            <w:pPr>
+              <w:spacing w:after="160" w:line="259" w:lineRule="auto"/>
+            </w:pPr>
+            <w:r>
+              <w:t>K</w:t>
+            </w:r>
+          </w:p>
+        </w:tc>
+        <w:tc>
+          <w:tcPr>
+            <w:tcW w:w="944" w:type="dxa"/>
+            <w:shd w:val="clear" w:color="auto" w:fill="92D050"/>
+            <w:vAlign w:val="center"/>
+          </w:tcPr>
+          <w:p>
+            <w:pPr>
+              <w:spacing w:after="160" w:line="259" w:lineRule="auto"/>
+            </w:pPr>
+            <w:r>
+              <w:t>X</w:t>
+            </w:r>
+          </w:p>
+        </w:tc>
+        <w:tc>
+          <w:tcPr>
+            <w:tcW w:w="944" w:type="dxa"/>
+            <w:shd w:val="clear" w:color="auto" w:fill="92D050"/>
+            <w:vAlign w:val="center"/>
+          </w:tcPr>
+          <w:p>
+            <w:pPr>
+              <w:spacing w:after="160" w:line="259" w:lineRule="auto"/>
+            </w:pPr>
+            <w:r>
+              <w:t>N</w:t>
+            </w:r>
+          </w:p>
+        </w:tc>
+        <w:tc>
+          <w:tcPr>
+            <w:tcW w:w="944" w:type="dxa"/>
+            <w:shd w:val="clear" w:color="auto" w:fill="92D050"/>
+            <w:vAlign w:val="center"/>
+          </w:tcPr>
+          <w:p>
+            <w:pPr>
+              <w:spacing w:after="160" w:line="259" w:lineRule="auto"/>
+            </w:pPr>
+            <w:r>
+              <w:t>F</w:t>
+            </w:r>
+          </w:p>
+        </w:tc>
+        <w:tc>
+          <w:tcPr>
+            <w:tcW w:w="944" w:type="dxa"/>
+            <w:shd w:val="clear" w:color="auto" w:fill="92D050"/>
+            <w:vAlign w:val="center"/>
+          </w:tcPr>
+          <w:p>
+            <w:pPr>
+              <w:spacing w:after="160" w:line="259" w:lineRule="auto"/>
+            </w:pPr>
+            <w:r>
+              <w:t>D</w:t>
+            </w:r>
+          </w:p>
+        </w:tc>
+        <w:tc>
+          <w:tcPr>
+            <w:tcW w:w="944" w:type="dxa"/>
+            <w:shd w:val="clear" w:color="auto" w:fill="92D050"/>
+            <w:vAlign w:val="center"/>
+          </w:tcPr>
+          <w:p>
+            <w:pPr>
+              <w:spacing w:after="160" w:line="259" w:lineRule="auto"/>
+            </w:pPr>
+            <w:r>
+              <w:t>C</w:t>
+            </w:r>
+          </w:p>
+        </w:tc>
+        <w:tc>
+          <w:tcPr>
+            <w:tcW w:w="944" w:type="dxa"/>
+            <w:shd w:val="clear" w:color="auto" w:fill="92D050"/>
+            <w:vAlign w:val="center"/>
+          </w:tcPr>
+          <w:p>
+            <w:pPr>
+              <w:spacing w:after="160" w:line="259" w:lineRule="auto"/>
+            </w:pPr>
+            <w:r>
+              <w:t>O</w:t>
+            </w:r>
+          </w:p>
+        </w:tc>
+      </w:tr>
+    </w:tbl>
+    <w:p/>
+    <w:tbl>
+      <w:tblPr>
+        <w:tblStyle w:val="Tablaconcuadrcula"/>
+        <w:tblW w:w="0" w:type="auto"/>
+        <w:tblLook w:val="04A0" w:firstRow="1" w:lastRow="0" w:firstColumn="1" w:lastColumn="0" w:noHBand="0" w:noVBand="1"/>
+      </w:tblPr>
+      <w:tblGrid>
+        <w:gridCol w:w="849"/>
+        <w:gridCol w:w="849"/>
+        <w:gridCol w:w="849"/>
+        <w:gridCol w:w="849"/>
+        <w:gridCol w:w="849"/>
+        <w:gridCol w:w="849"/>
+        <w:gridCol w:w="850"/>
+        <w:gridCol w:w="850"/>
+        <w:gridCol w:w="850"/>
+        <w:gridCol w:w="850"/>
+      </w:tblGrid>
+      <w:tr>
+        <w:tc>
+          <w:tcPr>
+            <w:tcW w:w="849" w:type="dxa"/>
+            <w:vAlign w:val="center"/>
+          </w:tcPr>
+          <w:p>
+            <w:pPr>
+              <w:spacing w:after="160" w:line="259" w:lineRule="auto"/>
+            </w:pPr>
+            <w:r>
+              <w:t>1</w:t>
+            </w:r>
+          </w:p>
+        </w:tc>
+        <w:tc>
+          <w:tcPr>
+            <w:tcW w:w="849" w:type="dxa"/>
+            <w:vAlign w:val="center"/>
+          </w:tcPr>
+          <w:p>
+            <w:pPr>
+              <w:spacing w:after="160" w:line="259" w:lineRule="auto"/>
+            </w:pPr>
+            <w:r>
+              <w:t>2</w:t>
+            </w:r>
+          </w:p>
+        </w:tc>
+        <w:tc>
+          <w:tcPr>
+            <w:tcW w:w="849" w:type="dxa"/>
+            <w:vAlign w:val="center"/>
+          </w:tcPr>
+          <w:p>
+            <w:pPr>
+              <w:spacing w:after="160" w:line="259" w:lineRule="auto"/>
+            </w:pPr>
+            <w:r>
+              <w:t>0</w:t>
+            </w:r>
+          </w:p>
+        </w:tc>
+        <w:tc>
+          <w:tcPr>
+            <w:tcW w:w="849" w:type="dxa"/>
+            <w:vAlign w:val="center"/>
+          </w:tcPr>
+          <w:p>
+            <w:pPr>
+              <w:spacing w:after="160" w:line="259" w:lineRule="auto"/>
+            </w:pPr>
+            <w:r>
+              <w:t>4</w:t>
+            </w:r>
+          </w:p>
+        </w:tc>
+        <w:tc>
+          <w:tcPr>
+            <w:tcW w:w="849" w:type="dxa"/>
+            <w:vAlign w:val="center"/>
+          </w:tcPr>
+          <w:p>
+            <w:pPr>
+              <w:spacing w:after="160" w:line="259" w:lineRule="auto"/>
+            </w:pPr>
+            <w:r>
+              <w:t>2</w:t>
+            </w:r>
+          </w:p>
+        </w:tc>
+        <w:tc>
+          <w:tcPr>
+            <w:tcW w:w="849" w:type="dxa"/>
+            <w:vAlign w:val="center"/>
+          </w:tcPr>
+          <w:p>
+            <w:pPr>
+              <w:spacing w:after="160" w:line="259" w:lineRule="auto"/>
+            </w:pPr>
+            <w:r>
+              <w:t>1</w:t>
+            </w:r>
+          </w:p>
+        </w:tc>
+        <w:tc>
+          <w:tcPr>
+            <w:tcW w:w="850" w:type="dxa"/>
+            <w:vAlign w:val="center"/>
+          </w:tcPr>
+          <w:p>
+            <w:pPr>
+              <w:spacing w:after="160" w:line="259" w:lineRule="auto"/>
+            </w:pPr>
+            <w:r>
+              <w:t>2</w:t>
+            </w:r>
+          </w:p>
+        </w:tc>
+        <w:tc>
+          <w:tcPr>
+            <w:tcW w:w="850" w:type="dxa"/>
+            <w:vAlign w:val="center"/>
+          </w:tcPr>
+          <w:p>
+            <w:pPr>
+              <w:spacing w:after="160" w:line="259" w:lineRule="auto"/>
+            </w:pPr>
+            <w:r>
+              <w:t>1</w:t>
+            </w:r>
+          </w:p>
+        </w:tc>
+        <w:tc>
+          <w:tcPr>
+            <w:tcW w:w="850" w:type="dxa"/>
+            <w:vAlign w:val="center"/>
+          </w:tcPr>
+          <w:p>
+            <w:pPr>
+              <w:spacing w:after="160" w:line="259" w:lineRule="auto"/>
+            </w:pPr>
+            <w:r>
+              <w:t>2</w:t>
+            </w:r>
+          </w:p>
+        </w:tc>
+        <w:tc>
+          <w:tcPr>
+            <w:tcW w:w="850" w:type="dxa"/>
+            <w:vAlign w:val="center"/>
+          </w:tcPr>
+          <w:p>
+            <w:pPr>
+              <w:spacing w:after="160" w:line="259" w:lineRule="auto"/>
+            </w:pPr>
+            <w:r>
+              <w:t>4</w:t>
+            </w:r>
+          </w:p>
+        </w:tc>
+      </w:tr>
+      <w:tr>
+        <w:tc>
+          <w:tcPr>
+            <w:tcW w:w="849" w:type="dxa"/>
+            <w:vAlign w:val="center"/>
+          </w:tcPr>
+          <w:p>
+            <w:pPr>
+              <w:spacing w:after="160" w:line="259" w:lineRule="auto"/>
+            </w:pPr>
+            <w:r>
+              <w:t>2</w:t>
+            </w:r>
+          </w:p>
+        </w:tc>
+        <w:tc>
+          <w:tcPr>
+            <w:tcW w:w="849" w:type="dxa"/>
+            <w:vAlign w:val="center"/>
+          </w:tcPr>
+          <w:p>
+            <w:pPr>
+              <w:spacing w:after="160" w:line="259" w:lineRule="auto"/>
+            </w:pPr>
+            <w:r>
+              <w:t>2</w:t>
+            </w:r>
+          </w:p>
+        </w:tc>
+        <w:tc>
+          <w:tcPr>
+            <w:tcW w:w="849" w:type="dxa"/>
+            <w:vAlign w:val="center"/>
+          </w:tcPr>
+          <w:p>
+            <w:pPr>
+              <w:spacing w:after="160" w:line="259" w:lineRule="auto"/>
+            </w:pPr>
+            <w:r>
+              <w:t>4</w:t>
+            </w:r>
+          </w:p>
+        </w:tc>
+        <w:tc>
+          <w:tcPr>
+            <w:tcW w:w="849" w:type="dxa"/>
+            <w:vAlign w:val="center"/>
+          </w:tcPr>
+          <w:p>
+            <w:pPr>
+              <w:spacing w:after="160" w:line="259" w:lineRule="auto"/>
+            </w:pPr>
+            <w:r>
+              <w:t>0</w:t>
+            </w:r>
+          </w:p>
+        </w:tc>
+        <w:tc>
+          <w:tcPr>
+            <w:tcW w:w="849" w:type="dxa"/>
+            <w:vAlign w:val="center"/>
+          </w:tcPr>
+          <w:p>
+            <w:pPr>
+              <w:spacing w:after="160" w:line="259" w:lineRule="auto"/>
+            </w:pPr>
+            <w:r>
+              <w:t>2</w:t>
+            </w:r>
+          </w:p>
+        </w:tc>
+        <w:tc>
+          <w:tcPr>
+            <w:tcW w:w="849" w:type="dxa"/>
+            <w:vAlign w:val="center"/>
+          </w:tcPr>
+          <w:p>
+            <w:pPr>
+              <w:spacing w:after="160" w:line="259" w:lineRule="auto"/>
+            </w:pPr>
+            <w:r>
+              <w:t>3</w:t>
+            </w:r>
+          </w:p>
+        </w:tc>
+        <w:tc>
+          <w:tcPr>
+            <w:tcW w:w="850" w:type="dxa"/>
+            <w:vAlign w:val="center"/>
+          </w:tcPr>
+          <w:p>
+            <w:pPr>
+              <w:spacing w:after="160" w:line="259" w:lineRule="auto"/>
+            </w:pPr>
+            <w:r>
+              <w:t>0</w:t>
+            </w:r>
+          </w:p>
+        </w:tc>
+        <w:tc>
+          <w:tcPr>
+            <w:tcW w:w="850" w:type="dxa"/>
+            <w:vAlign w:val="center"/>
+          </w:tcPr>
+          <w:p>
+            <w:pPr>
+              <w:spacing w:after="160" w:line="259" w:lineRule="auto"/>
+            </w:pPr>
+            <w:r>
+              <w:t>3</w:t>
+            </w:r>
+          </w:p>
+        </w:tc>
+        <w:tc>
+          <w:tcPr>
+            <w:tcW w:w="850" w:type="dxa"/>
+            <w:vAlign w:val="center"/>
+          </w:tcPr>
+          <w:p>
+            <w:pPr>
+              <w:spacing w:after="160" w:line="259" w:lineRule="auto"/>
+            </w:pPr>
+            <w:r>
+              <w:t>2</w:t>
+            </w:r>
+          </w:p>
+        </w:tc>
+        <w:tc>
+          <w:tcPr>
+            <w:tcW w:w="850" w:type="dxa"/>
+            <w:vAlign w:val="center"/>
+          </w:tcPr>
+          <w:p>
+            <w:pPr>
+              <w:spacing w:after="160" w:line="259" w:lineRule="auto"/>
+            </w:pPr>
+            <w:r>
+              <w:t>4</w:t>
+            </w:r>
+          </w:p>
+        </w:tc>
+      </w:tr>
+      <w:tr>
+        <w:tc>
+          <w:tcPr>
+            <w:tcW w:w="849" w:type="dxa"/>
+            <w:vAlign w:val="center"/>
+          </w:tcPr>
+          <w:p>
+            <w:pPr>
+              <w:spacing w:after="160" w:line="259" w:lineRule="auto"/>
+            </w:pPr>
+            <w:r>
+              <w:t>H</w:t>
+            </w:r>
+          </w:p>
+        </w:tc>
+        <w:tc>
+          <w:tcPr>
+            <w:tcW w:w="849" w:type="dxa"/>
+            <w:vAlign w:val="center"/>
+          </w:tcPr>
+          <w:p>
+            <w:pPr>
+              <w:spacing w:after="160" w:line="259" w:lineRule="auto"/>
+            </w:pPr>
+            <w:r>
+              <w:t>M</w:t>
+            </w:r>
+          </w:p>
+        </w:tc>
+        <w:tc>
+          <w:tcPr>
+            <w:tcW w:w="849" w:type="dxa"/>
+            <w:vAlign w:val="center"/>
+          </w:tcPr>
+          <w:p>
+            <w:pPr>
+              <w:spacing w:after="160" w:line="259" w:lineRule="auto"/>
+            </w:pPr>
+            <w:r>
+              <w:t>E</w:t>
+            </w:r>
+          </w:p>
+        </w:tc>
+        <w:tc>
+          <w:tcPr>
+            <w:tcW w:w="849" w:type="dxa"/>
+            <w:vAlign w:val="center"/>
+          </w:tcPr>
+          <w:p>
+            <w:pPr>
+              <w:spacing w:after="160" w:line="259" w:lineRule="auto"/>
+            </w:pPr>
+            <w:r>
+              <w:t>U</w:t>
+            </w:r>
+          </w:p>
+        </w:tc>
+        <w:tc>
+          <w:tcPr>
+            <w:tcW w:w="849" w:type="dxa"/>
+            <w:vAlign w:val="center"/>
+          </w:tcPr>
+          <w:p>
+            <w:pPr>
+              <w:spacing w:after="160" w:line="259" w:lineRule="auto"/>
+            </w:pPr>
+            <w:r>
+              <w:t>M</w:t>
+            </w:r>
+          </w:p>
+        </w:tc>
+        <w:tc>
+          <w:tcPr>
+            <w:tcW w:w="849" w:type="dxa"/>
+            <w:vAlign w:val="center"/>
+          </w:tcPr>
+          <w:p>
+            <w:pPr>
+              <w:spacing w:after="160" w:line="259" w:lineRule="auto"/>
+            </w:pPr>
+            <w:r>
+              <w:t>I</w:t>
+            </w:r>
+          </w:p>
+        </w:tc>
+        <w:tc>
+          <w:tcPr>
+            <w:tcW w:w="850" w:type="dxa"/>
+            <w:vAlign w:val="center"/>
+          </w:tcPr>
+          <w:p>
+            <w:pPr>
+              <w:spacing w:after="160" w:line="259" w:lineRule="auto"/>
+            </w:pPr>
+            <w:r>
+              <w:t>K</w:t>
+            </w:r>
+          </w:p>
+        </w:tc>
+        <w:tc>
+          <w:tcPr>
+            <w:tcW w:w="850" w:type="dxa"/>
+            <w:vAlign w:val="center"/>
+          </w:tcPr>
+          <w:p>
+            <w:pPr>
+              <w:spacing w:after="160" w:line="259" w:lineRule="auto"/>
+            </w:pPr>
+            <w:r>
+              <w:t>I</w:t>
+            </w:r>
+          </w:p>
+        </w:tc>
+        <w:tc>
+          <w:tcPr>
+            <w:tcW w:w="850" w:type="dxa"/>
+            <w:vAlign w:val="center"/>
+          </w:tcPr>
+          <w:p>
+            <w:pPr>
+              <w:spacing w:after="160" w:line="259" w:lineRule="auto"/>
+            </w:pPr>
+            <w:r>
+              <w:t>M</w:t>
+            </w:r>
+          </w:p>
+        </w:tc>
+        <w:tc>
+          <w:tcPr>
+            <w:tcW w:w="850" w:type="dxa"/>
+            <w:vAlign w:val="center"/>
+          </w:tcPr>
+          <w:p>
+            <w:pPr>
+              <w:spacing w:after="160" w:line="259" w:lineRule="auto"/>
+            </w:pPr>
+            <w:r>
+              <w:t>Z</w:t>
+            </w:r>
+          </w:p>
+        </w:tc>
+      </w:tr>
+    </w:tbl>
+    <w:p/>
+    <w:tbl>
+      <w:tblPr>
+        <w:tblStyle w:val="Tablaconcuadrcula"/>
+        <w:tblW w:w="0" w:type="auto"/>
+        <w:tblLook w:val="04A0" w:firstRow="1" w:lastRow="0" w:firstColumn="1" w:lastColumn="0" w:noHBand="0" w:noVBand="1"/>
+      </w:tblPr>
+      <w:tblGrid>
+        <w:gridCol w:w="849"/>
+        <w:gridCol w:w="849"/>
+        <w:gridCol w:w="849"/>
+        <w:gridCol w:w="849"/>
+        <w:gridCol w:w="849"/>
+        <w:gridCol w:w="849"/>
+        <w:gridCol w:w="850"/>
+        <w:gridCol w:w="850"/>
+        <w:gridCol w:w="850"/>
+        <w:gridCol w:w="850"/>
+      </w:tblGrid>
+      <w:tr>
+        <w:tc>
+          <w:tcPr>
+            <w:tcW w:w="849" w:type="dxa"/>
+          </w:tcPr>
+          <w:p>
+            <w:pPr>
+              <w:spacing w:after="160" w:line="259" w:lineRule="auto"/>
+            </w:pPr>
+            <w:r>
+              <w:t>1</w:t>
+            </w:r>
+          </w:p>
+        </w:tc>
+        <w:tc>
+          <w:tcPr>
+            <w:tcW w:w="849" w:type="dxa"/>
+          </w:tcPr>
+          <w:p>
+            <w:pPr>
+              <w:spacing w:after="160" w:line="259" w:lineRule="auto"/>
+            </w:pPr>
+            <w:r>
+              <w:t>0</w:t>
+            </w:r>
+          </w:p>
+        </w:tc>
+        <w:tc>
+          <w:tcPr>
+            <w:tcW w:w="849" w:type="dxa"/>
+          </w:tcPr>
+          <w:p>
+            <w:pPr>
+              <w:spacing w:after="160" w:line="259" w:lineRule="auto"/>
+            </w:pPr>
+            <w:r>
+              <w:t>2</w:t>
+            </w:r>
+          </w:p>
+        </w:tc>
+        <w:tc>
+          <w:tcPr>
+            <w:tcW w:w="849" w:type="dxa"/>
+          </w:tcPr>
+          <w:p>
+            <w:pPr>
+              <w:spacing w:after="160" w:line="259" w:lineRule="auto"/>
+            </w:pPr>
+            <w:r>
+              <w:t>2</w:t>
+            </w:r>
+          </w:p>
+        </w:tc>
+        <w:tc>
+          <w:tcPr>
+            <w:tcW w:w="849" w:type="dxa"/>
+          </w:tcPr>
+          <w:p>
+            <w:pPr>
+              <w:spacing w:after="160" w:line="259" w:lineRule="auto"/>
+            </w:pPr>
+          </w:p>
+        </w:tc>
+        <w:tc>
+          <w:tcPr>
+            <w:tcW w:w="849" w:type="dxa"/>
+          </w:tcPr>
+          <w:p>
+            <w:pPr>
+              <w:spacing w:after="160" w:line="259" w:lineRule="auto"/>
+            </w:pPr>
+          </w:p>
+        </w:tc>
+        <w:tc>
+          <w:tcPr>
+            <w:tcW w:w="850" w:type="dxa"/>
+          </w:tcPr>
+          <w:p>
+            <w:pPr>
+              <w:spacing w:after="160" w:line="259" w:lineRule="auto"/>
+            </w:pPr>
+          </w:p>
+        </w:tc>
+        <w:tc>
+          <w:tcPr>
+            <w:tcW w:w="850" w:type="dxa"/>
+          </w:tcPr>
+          <w:p>
+            <w:pPr>
+              <w:spacing w:after="160" w:line="259" w:lineRule="auto"/>
+            </w:pPr>
+          </w:p>
+        </w:tc>
+        <w:tc>
+          <w:tcPr>
+            <w:tcW w:w="850" w:type="dxa"/>
+          </w:tcPr>
+          <w:p>
+            <w:pPr>
+              <w:spacing w:after="160" w:line="259" w:lineRule="auto"/>
+            </w:pPr>
+          </w:p>
+        </w:tc>
+        <w:tc>
+          <w:tcPr>
+            <w:tcW w:w="850" w:type="dxa"/>
+          </w:tcPr>
+          <w:p>
+            <w:pPr>
+              <w:spacing w:after="160" w:line="259" w:lineRule="auto"/>
+            </w:pPr>
+          </w:p>
+        </w:tc>
+      </w:tr>
+      <w:tr>
+        <w:tc>
+          <w:tcPr>
+            <w:tcW w:w="849" w:type="dxa"/>
+          </w:tcPr>
+          <w:p>
+            <w:pPr>
+              <w:spacing w:after="160" w:line="259" w:lineRule="auto"/>
+            </w:pPr>
+            <w:r>
+              <w:t>2</w:t>
+            </w:r>
+          </w:p>
+        </w:tc>
+        <w:tc>
+          <w:tcPr>
+            <w:tcW w:w="849" w:type="dxa"/>
+          </w:tcPr>
+          <w:p>
+            <w:pPr>
+              <w:spacing w:after="160" w:line="259" w:lineRule="auto"/>
+            </w:pPr>
+            <w:r>
+              <w:t>4</w:t>
+            </w:r>
+          </w:p>
+        </w:tc>
+        <w:tc>
+          <w:tcPr>
+            <w:tcW w:w="849" w:type="dxa"/>
+          </w:tcPr>
+          <w:p>
+            <w:pPr>
+              <w:spacing w:after="160" w:line="259" w:lineRule="auto"/>
+            </w:pPr>
+            <w:r>
+              <w:t>1</w:t>
+            </w:r>
+          </w:p>
+        </w:tc>
+        <w:tc>
+          <w:tcPr>
+            <w:tcW w:w="849" w:type="dxa"/>
+          </w:tcPr>
+          <w:p>
+            <w:pPr>
+              <w:spacing w:after="160" w:line="259" w:lineRule="auto"/>
+            </w:pPr>
+            <w:r>
+              <w:t>0</w:t>
+            </w:r>
+          </w:p>
+        </w:tc>
+        <w:tc>
+          <w:tcPr>
+            <w:tcW w:w="849" w:type="dxa"/>
+          </w:tcPr>
+          <w:p>
+            <w:pPr>
+              <w:spacing w:after="160" w:line="259" w:lineRule="auto"/>
+            </w:pPr>
+          </w:p>
+        </w:tc>
+        <w:tc>
+          <w:tcPr>
+            <w:tcW w:w="849" w:type="dxa"/>
+          </w:tcPr>
+          <w:p>
+            <w:pPr>
+              <w:spacing w:after="160" w:line="259" w:lineRule="auto"/>
+            </w:pPr>
+          </w:p>
+        </w:tc>
+        <w:tc>
+          <w:tcPr>
+            <w:tcW w:w="850" w:type="dxa"/>
+          </w:tcPr>
+          <w:p>
+            <w:pPr>
+              <w:spacing w:after="160" w:line="259" w:lineRule="auto"/>
+            </w:pPr>
+          </w:p>
+        </w:tc>
+        <w:tc>
+          <w:tcPr>
+            <w:tcW w:w="850" w:type="dxa"/>
+          </w:tcPr>
+          <w:p>
+            <w:pPr>
+              <w:spacing w:after="160" w:line="259" w:lineRule="auto"/>
+            </w:pPr>
+          </w:p>
+        </w:tc>
+        <w:tc>
+          <w:tcPr>
+            <w:tcW w:w="850" w:type="dxa"/>
+          </w:tcPr>
+          <w:p>
+            <w:pPr>
+              <w:spacing w:after="160" w:line="259" w:lineRule="auto"/>
+            </w:pPr>
+          </w:p>
+        </w:tc>
+        <w:tc>
+          <w:tcPr>
+            <w:tcW w:w="850" w:type="dxa"/>
+          </w:tcPr>
+          <w:p>
+            <w:pPr>
+              <w:spacing w:after="160" w:line="259" w:lineRule="auto"/>
+            </w:pPr>
+          </w:p>
+        </w:tc>
+      </w:tr>
+      <w:tr>
+        <w:tc>
+          <w:tcPr>
+            <w:tcW w:w="849" w:type="dxa"/>
+          </w:tcPr>
+          <w:p>
+            <w:pPr>
+              <w:spacing w:after="160" w:line="259" w:lineRule="auto"/>
+            </w:pPr>
+          </w:p>
+        </w:tc>
+        <w:tc>
+          <w:tcPr>
+            <w:tcW w:w="849" w:type="dxa"/>
+          </w:tcPr>
+          <w:p>
+            <w:pPr>
+              <w:spacing w:after="160" w:line="259" w:lineRule="auto"/>
+            </w:pPr>
+          </w:p>
+        </w:tc>
+        <w:tc>
+          <w:tcPr>
+            <w:tcW w:w="849" w:type="dxa"/>
+          </w:tcPr>
+          <w:p>
+            <w:pPr>
+              <w:spacing w:after="160" w:line="259" w:lineRule="auto"/>
+            </w:pPr>
+          </w:p>
+        </w:tc>
+        <w:tc>
+          <w:tcPr>
+            <w:tcW w:w="849" w:type="dxa"/>
+          </w:tcPr>
+          <w:p>
+            <w:pPr>
+              <w:spacing w:after="160" w:line="259" w:lineRule="auto"/>
+            </w:pPr>
+          </w:p>
+        </w:tc>
+        <w:tc>
+          <w:tcPr>
+            <w:tcW w:w="849" w:type="dxa"/>
+          </w:tcPr>
+          <w:p>
+            <w:pPr>
+              <w:spacing w:after="160" w:line="259" w:lineRule="auto"/>
+            </w:pPr>
+          </w:p>
+        </w:tc>
+        <w:tc>
+          <w:tcPr>
+            <w:tcW w:w="849" w:type="dxa"/>
+          </w:tcPr>
+          <w:p>
+            <w:pPr>
+              <w:spacing w:after="160" w:line="259" w:lineRule="auto"/>
+            </w:pPr>
+          </w:p>
+        </w:tc>
+        <w:tc>
+          <w:tcPr>
+            <w:tcW w:w="850" w:type="dxa"/>
+          </w:tcPr>
+          <w:p>
+            <w:pPr>
+              <w:spacing w:after="160" w:line="259" w:lineRule="auto"/>
+            </w:pPr>
+          </w:p>
+        </w:tc>
+        <w:tc>
+          <w:tcPr>
+            <w:tcW w:w="850" w:type="dxa"/>
+          </w:tcPr>
+          <w:p>
+            <w:pPr>
+              <w:spacing w:after="160" w:line="259" w:lineRule="auto"/>
+            </w:pPr>
+          </w:p>
+        </w:tc>
+        <w:tc>
+          <w:tcPr>
+            <w:tcW w:w="850" w:type="dxa"/>
+          </w:tcPr>
+          <w:p>
+            <w:pPr>
+              <w:spacing w:after="160" w:line="259" w:lineRule="auto"/>
+            </w:pPr>
+          </w:p>
+        </w:tc>
+        <w:tc>
+          <w:tcPr>
+            <w:tcW w:w="850" w:type="dxa"/>
+          </w:tcPr>
+          <w:p>
+            <w:pPr>
+              <w:spacing w:after="160" w:line="259" w:lineRule="auto"/>
+            </w:pPr>
+          </w:p>
+        </w:tc>
+      </w:tr>
+    </w:tbl>
+    <w:p>
+      <w:r>
+        <w:t xml:space="preserve">Mensaje: e, </w:t>
+      </w:r>
+      <w:proofErr w:type="spellStart"/>
+      <w:r>
+        <w:t>hokxnfdco</w:t>
+      </w:r>
+      <w:proofErr w:type="spellEnd"/>
+    </w:p>
+    <w:tbl>
+      <w:tblPr>
+        <w:tblStyle w:val="Tablaconcuadrcula"/>
+        <w:tblW w:w="8493" w:type="dxa"/>
+        <w:tblLook w:val="04A0" w:firstRow="1" w:lastRow="0" w:firstColumn="1" w:lastColumn="0" w:noHBand="0" w:noVBand="1"/>
+      </w:tblPr>
+      <w:tblGrid>
+        <w:gridCol w:w="849"/>
+        <w:gridCol w:w="849"/>
+        <w:gridCol w:w="849"/>
+        <w:gridCol w:w="849"/>
+        <w:gridCol w:w="849"/>
+        <w:gridCol w:w="849"/>
+        <w:gridCol w:w="849"/>
+        <w:gridCol w:w="850"/>
+        <w:gridCol w:w="850"/>
+        <w:gridCol w:w="850"/>
+      </w:tblGrid>
+      <w:tr>
+        <w:tc>
+          <w:tcPr>
+            <w:tcW w:w="849" w:type="dxa"/>
+            <w:shd w:val="clear" w:color="auto" w:fill="92D050"/>
+            <w:vAlign w:val="center"/>
+          </w:tcPr>
+          <w:p>
+            <w:pPr>
+              <w:spacing w:after="160" w:line="259" w:lineRule="auto"/>
+            </w:pPr>
+            <w:r>
+              <w:lastRenderedPageBreak/>
+              <w:t>Letra</w:t>
+            </w:r>
+          </w:p>
+        </w:tc>
+        <w:tc>
+          <w:tcPr>
+            <w:tcW w:w="849" w:type="dxa"/>
+            <w:shd w:val="clear" w:color="auto" w:fill="92D050"/>
+            <w:vAlign w:val="center"/>
+          </w:tcPr>
+          <w:p>
+            <w:pPr>
+              <w:spacing w:after="160" w:line="259" w:lineRule="auto"/>
+            </w:pPr>
+            <w:r>
+              <w:t>H</w:t>
+            </w:r>
+          </w:p>
+        </w:tc>
+        <w:tc>
+          <w:tcPr>
+            <w:tcW w:w="849" w:type="dxa"/>
+            <w:shd w:val="clear" w:color="auto" w:fill="92D050"/>
+            <w:vAlign w:val="center"/>
+          </w:tcPr>
+          <w:p>
+            <w:pPr>
+              <w:spacing w:after="160" w:line="259" w:lineRule="auto"/>
+            </w:pPr>
+            <w:r>
+              <w:t>O</w:t>
+            </w:r>
+          </w:p>
+        </w:tc>
+        <w:tc>
+          <w:tcPr>
+            <w:tcW w:w="849" w:type="dxa"/>
+            <w:shd w:val="clear" w:color="auto" w:fill="92D050"/>
+            <w:vAlign w:val="center"/>
+          </w:tcPr>
+          <w:p>
+            <w:pPr>
+              <w:spacing w:after="160" w:line="259" w:lineRule="auto"/>
+            </w:pPr>
+            <w:r>
+              <w:t>K</w:t>
+            </w:r>
+          </w:p>
+        </w:tc>
+        <w:tc>
+          <w:tcPr>
+            <w:tcW w:w="849" w:type="dxa"/>
+            <w:shd w:val="clear" w:color="auto" w:fill="92D050"/>
+            <w:vAlign w:val="center"/>
+          </w:tcPr>
+          <w:p>
+            <w:pPr>
+              <w:spacing w:after="160" w:line="259" w:lineRule="auto"/>
+            </w:pPr>
+            <w:r>
+              <w:t>X</w:t>
+            </w:r>
+          </w:p>
+        </w:tc>
+        <w:tc>
+          <w:tcPr>
+            <w:tcW w:w="849" w:type="dxa"/>
+            <w:shd w:val="clear" w:color="auto" w:fill="92D050"/>
+            <w:vAlign w:val="center"/>
+          </w:tcPr>
+          <w:p>
+            <w:pPr>
+              <w:spacing w:after="160" w:line="259" w:lineRule="auto"/>
+            </w:pPr>
+            <w:r>
+              <w:t>N</w:t>
+            </w:r>
+          </w:p>
+        </w:tc>
+        <w:tc>
+          <w:tcPr>
+            <w:tcW w:w="849" w:type="dxa"/>
+            <w:shd w:val="clear" w:color="auto" w:fill="92D050"/>
+            <w:vAlign w:val="center"/>
+          </w:tcPr>
+          <w:p>
+            <w:pPr>
+              <w:spacing w:after="160" w:line="259" w:lineRule="auto"/>
+            </w:pPr>
+            <w:r>
+              <w:t>F</w:t>
+            </w:r>
+          </w:p>
+        </w:tc>
+        <w:tc>
+          <w:tcPr>
+            <w:tcW w:w="850" w:type="dxa"/>
+            <w:shd w:val="clear" w:color="auto" w:fill="92D050"/>
+            <w:vAlign w:val="center"/>
+          </w:tcPr>
+          <w:p>
+            <w:pPr>
+              <w:spacing w:after="160" w:line="259" w:lineRule="auto"/>
+            </w:pPr>
+            <w:r>
+              <w:t>D</w:t>
+            </w:r>
+          </w:p>
+        </w:tc>
+        <w:tc>
+          <w:tcPr>
+            <w:tcW w:w="850" w:type="dxa"/>
+            <w:shd w:val="clear" w:color="auto" w:fill="92D050"/>
+            <w:vAlign w:val="center"/>
+          </w:tcPr>
+          <w:p>
+            <w:pPr>
+              <w:spacing w:after="160" w:line="259" w:lineRule="auto"/>
+            </w:pPr>
+            <w:r>
+              <w:t>C</w:t>
+            </w:r>
+          </w:p>
+        </w:tc>
+        <w:tc>
+          <w:tcPr>
+            <w:tcW w:w="850" w:type="dxa"/>
+            <w:shd w:val="clear" w:color="auto" w:fill="92D050"/>
+            <w:vAlign w:val="center"/>
+          </w:tcPr>
+          <w:p>
+            <w:pPr>
+              <w:spacing w:after="160" w:line="259" w:lineRule="auto"/>
+            </w:pPr>
+            <w:r>
+              <w:t>O</w:t>
+            </w:r>
+          </w:p>
+        </w:tc>
+      </w:tr>
+      <w:tr>
+        <w:tc>
+          <w:tcPr>
+            <w:tcW w:w="849" w:type="dxa"/>
+            <w:shd w:val="clear" w:color="auto" w:fill="92D050"/>
+            <w:vAlign w:val="center"/>
+          </w:tcPr>
+          <w:p>
+            <w:pPr>
+              <w:spacing w:after="160" w:line="259" w:lineRule="auto"/>
+            </w:pPr>
+            <w:r>
+              <w:t>Fil</w:t>
+            </w:r>
+          </w:p>
+        </w:tc>
+        <w:tc>
+          <w:tcPr>
+            <w:tcW w:w="849" w:type="dxa"/>
+            <w:shd w:val="clear" w:color="auto" w:fill="92D050"/>
+            <w:vAlign w:val="center"/>
+          </w:tcPr>
+          <w:p>
+            <w:pPr>
+              <w:spacing w:after="160" w:line="259" w:lineRule="auto"/>
+            </w:pPr>
+            <w:r>
+              <w:t>1</w:t>
+            </w:r>
+          </w:p>
+        </w:tc>
+        <w:tc>
+          <w:tcPr>
+            <w:tcW w:w="849" w:type="dxa"/>
+            <w:shd w:val="clear" w:color="auto" w:fill="92D050"/>
+            <w:vAlign w:val="center"/>
+          </w:tcPr>
+          <w:p>
+            <w:pPr>
+              <w:spacing w:after="160" w:line="259" w:lineRule="auto"/>
+            </w:pPr>
+            <w:r>
+              <w:t>2</w:t>
+            </w:r>
+          </w:p>
+        </w:tc>
+        <w:tc>
+          <w:tcPr>
+            <w:tcW w:w="849" w:type="dxa"/>
+            <w:shd w:val="clear" w:color="auto" w:fill="92D050"/>
+            <w:vAlign w:val="center"/>
+          </w:tcPr>
+          <w:p>
+            <w:pPr>
+              <w:spacing w:after="160" w:line="259" w:lineRule="auto"/>
+            </w:pPr>
+            <w:r>
+              <w:t>2</w:t>
+            </w:r>
+          </w:p>
+        </w:tc>
+        <w:tc>
+          <w:tcPr>
+            <w:tcW w:w="849" w:type="dxa"/>
+            <w:shd w:val="clear" w:color="auto" w:fill="92D050"/>
+            <w:vAlign w:val="center"/>
+          </w:tcPr>
+          <w:p>
+            <w:pPr>
+              <w:spacing w:after="160" w:line="259" w:lineRule="auto"/>
+            </w:pPr>
+            <w:r>
+              <w:t>4</w:t>
+            </w:r>
+          </w:p>
+        </w:tc>
+        <w:tc>
+          <w:tcPr>
+            <w:tcW w:w="849" w:type="dxa"/>
+            <w:shd w:val="clear" w:color="auto" w:fill="92D050"/>
+            <w:vAlign w:val="center"/>
+          </w:tcPr>
+          <w:p>
+            <w:pPr>
+              <w:spacing w:after="160" w:line="259" w:lineRule="auto"/>
+            </w:pPr>
+            <w:r>
+              <w:t>2</w:t>
+            </w:r>
+          </w:p>
+        </w:tc>
+        <w:tc>
+          <w:tcPr>
+            <w:tcW w:w="849" w:type="dxa"/>
+            <w:shd w:val="clear" w:color="auto" w:fill="92D050"/>
+            <w:vAlign w:val="center"/>
+          </w:tcPr>
+          <w:p>
+            <w:pPr>
+              <w:spacing w:after="160" w:line="259" w:lineRule="auto"/>
+            </w:pPr>
+            <w:r>
+              <w:t>1</w:t>
+            </w:r>
+          </w:p>
+        </w:tc>
+        <w:tc>
+          <w:tcPr>
+            <w:tcW w:w="850" w:type="dxa"/>
+            <w:shd w:val="clear" w:color="auto" w:fill="92D050"/>
+            <w:vAlign w:val="center"/>
+          </w:tcPr>
+          <w:p>
+            <w:pPr>
+              <w:spacing w:after="160" w:line="259" w:lineRule="auto"/>
+            </w:pPr>
+            <w:r>
+              <w:t>0</w:t>
+            </w:r>
+          </w:p>
+        </w:tc>
+        <w:tc>
+          <w:tcPr>
+            <w:tcW w:w="850" w:type="dxa"/>
+            <w:shd w:val="clear" w:color="auto" w:fill="92D050"/>
+            <w:vAlign w:val="center"/>
+          </w:tcPr>
+          <w:p>
+            <w:pPr>
+              <w:spacing w:after="160" w:line="259" w:lineRule="auto"/>
+            </w:pPr>
+            <w:r>
+              <w:t>0</w:t>
+            </w:r>
+          </w:p>
+        </w:tc>
+        <w:tc>
+          <w:tcPr>
+            <w:tcW w:w="850" w:type="dxa"/>
+            <w:shd w:val="clear" w:color="auto" w:fill="92D050"/>
+            <w:vAlign w:val="center"/>
+          </w:tcPr>
+          <w:p>
+            <w:pPr>
+              <w:spacing w:after="160" w:line="259" w:lineRule="auto"/>
+            </w:pPr>
+            <w:r>
+              <w:t>2</w:t>
+            </w:r>
+          </w:p>
+        </w:tc>
+      </w:tr>
+      <w:tr>
+        <w:tc>
+          <w:tcPr>
+            <w:tcW w:w="849" w:type="dxa"/>
+            <w:shd w:val="clear" w:color="auto" w:fill="92D050"/>
+            <w:vAlign w:val="center"/>
+          </w:tcPr>
+          <w:p>
+            <w:pPr>
+              <w:spacing w:after="160" w:line="259" w:lineRule="auto"/>
+            </w:pPr>
+            <w:r>
+              <w:t>Col</w:t>
+            </w:r>
+          </w:p>
+        </w:tc>
+        <w:tc>
+          <w:tcPr>
+            <w:tcW w:w="849" w:type="dxa"/>
+            <w:shd w:val="clear" w:color="auto" w:fill="92D050"/>
+            <w:vAlign w:val="center"/>
+          </w:tcPr>
+          <w:p>
+            <w:pPr>
+              <w:spacing w:after="160" w:line="259" w:lineRule="auto"/>
+            </w:pPr>
+            <w:r>
+              <w:t>2</w:t>
+            </w:r>
+          </w:p>
+        </w:tc>
+        <w:tc>
+          <w:tcPr>
+            <w:tcW w:w="849" w:type="dxa"/>
+            <w:shd w:val="clear" w:color="auto" w:fill="92D050"/>
+            <w:vAlign w:val="center"/>
+          </w:tcPr>
+          <w:p>
+            <w:pPr>
+              <w:spacing w:after="160" w:line="259" w:lineRule="auto"/>
+            </w:pPr>
+            <w:r>
+              <w:t>4</w:t>
+            </w:r>
+          </w:p>
+        </w:tc>
+        <w:tc>
+          <w:tcPr>
+            <w:tcW w:w="849" w:type="dxa"/>
+            <w:shd w:val="clear" w:color="auto" w:fill="92D050"/>
+            <w:vAlign w:val="center"/>
+          </w:tcPr>
+          <w:p>
+            <w:pPr>
+              <w:spacing w:after="160" w:line="259" w:lineRule="auto"/>
+            </w:pPr>
+            <w:r>
+              <w:t>0</w:t>
+            </w:r>
+          </w:p>
+        </w:tc>
+        <w:tc>
+          <w:tcPr>
+            <w:tcW w:w="849" w:type="dxa"/>
+            <w:shd w:val="clear" w:color="auto" w:fill="92D050"/>
+            <w:vAlign w:val="center"/>
+          </w:tcPr>
+          <w:p>
+            <w:pPr>
+              <w:spacing w:after="160" w:line="259" w:lineRule="auto"/>
+            </w:pPr>
+            <w:r>
+              <w:t>2</w:t>
+            </w:r>
+          </w:p>
+        </w:tc>
+        <w:tc>
+          <w:tcPr>
+            <w:tcW w:w="849" w:type="dxa"/>
+            <w:shd w:val="clear" w:color="auto" w:fill="92D050"/>
+            <w:vAlign w:val="center"/>
+          </w:tcPr>
+          <w:p>
+            <w:pPr>
+              <w:spacing w:after="160" w:line="259" w:lineRule="auto"/>
+            </w:pPr>
+            <w:r>
+              <w:t>3</w:t>
+            </w:r>
+          </w:p>
+        </w:tc>
+        <w:tc>
+          <w:tcPr>
+            <w:tcW w:w="849" w:type="dxa"/>
+            <w:shd w:val="clear" w:color="auto" w:fill="92D050"/>
+            <w:vAlign w:val="center"/>
+          </w:tcPr>
+          <w:p>
+            <w:pPr>
+              <w:spacing w:after="160" w:line="259" w:lineRule="auto"/>
+            </w:pPr>
+            <w:r>
+              <w:t>0</w:t>
+            </w:r>
+          </w:p>
+        </w:tc>
+        <w:tc>
+          <w:tcPr>
+            <w:tcW w:w="850" w:type="dxa"/>
+            <w:shd w:val="clear" w:color="auto" w:fill="92D050"/>
+            <w:vAlign w:val="center"/>
+          </w:tcPr>
+          <w:p>
+            <w:pPr>
+              <w:spacing w:after="160" w:line="259" w:lineRule="auto"/>
+            </w:pPr>
+            <w:r>
+              <w:t>3</w:t>
+            </w:r>
+          </w:p>
+        </w:tc>
+        <w:tc>
+          <w:tcPr>
+            <w:tcW w:w="850" w:type="dxa"/>
+            <w:shd w:val="clear" w:color="auto" w:fill="92D050"/>
+            <w:vAlign w:val="center"/>
+          </w:tcPr>
+          <w:p>
+            <w:pPr>
+              <w:spacing w:after="160" w:line="259" w:lineRule="auto"/>
+            </w:pPr>
+            <w:r>
+              <w:t>2</w:t>
+            </w:r>
+          </w:p>
+        </w:tc>
+        <w:tc>
+          <w:tcPr>
+            <w:tcW w:w="850" w:type="dxa"/>
+            <w:shd w:val="clear" w:color="auto" w:fill="92D050"/>
+            <w:vAlign w:val="center"/>
+          </w:tcPr>
+          <w:p>
+            <w:pPr>
+              <w:spacing w:after="160" w:line="259" w:lineRule="auto"/>
+            </w:pPr>
+            <w:r>
+              <w:t>4</w:t>
+            </w:r>
+          </w:p>
+        </w:tc>
+      </w:tr>
+    </w:tbl>
+    <w:p/>
+    <w:tbl>
+      <w:tblPr>
+        <w:tblStyle w:val="Tablaconcuadrcula"/>
+        <w:tblW w:w="0" w:type="auto"/>
+        <w:tblLook w:val="04A0" w:firstRow="1" w:lastRow="0" w:firstColumn="1" w:lastColumn="0" w:noHBand="0" w:noVBand="1"/>
+      </w:tblPr>
+      <w:tblGrid>
+        <w:gridCol w:w="943"/>
+        <w:gridCol w:w="943"/>
+        <w:gridCol w:w="944"/>
+        <w:gridCol w:w="944"/>
+        <w:gridCol w:w="944"/>
+        <w:gridCol w:w="944"/>
+        <w:gridCol w:w="944"/>
+        <w:gridCol w:w="944"/>
+        <w:gridCol w:w="944"/>
+      </w:tblGrid>
+      <w:tr>
+        <w:tc>
+          <w:tcPr>
+            <w:tcW w:w="943" w:type="dxa"/>
+            <w:shd w:val="clear" w:color="auto" w:fill="92D050"/>
+            <w:vAlign w:val="center"/>
+          </w:tcPr>
+          <w:p>
+            <w:pPr>
+              <w:spacing w:after="160" w:line="259" w:lineRule="auto"/>
+            </w:pPr>
+            <w:r>
+              <w:t>1</w:t>
+            </w:r>
+          </w:p>
+        </w:tc>
+        <w:tc>
+          <w:tcPr>
+            <w:tcW w:w="943" w:type="dxa"/>
+            <w:shd w:val="clear" w:color="auto" w:fill="92D050"/>
+            <w:vAlign w:val="center"/>
+          </w:tcPr>
+          <w:p>
+            <w:pPr>
+              <w:spacing w:after="160" w:line="259" w:lineRule="auto"/>
+            </w:pPr>
+            <w:r>
+              <w:t>2</w:t>
+            </w:r>
+          </w:p>
+        </w:tc>
+        <w:tc>
+          <w:tcPr>
+            <w:tcW w:w="944" w:type="dxa"/>
+            <w:shd w:val="clear" w:color="auto" w:fill="92D050"/>
+            <w:vAlign w:val="center"/>
+          </w:tcPr>
+          <w:p>
+            <w:pPr>
+              <w:spacing w:after="160" w:line="259" w:lineRule="auto"/>
+            </w:pPr>
+            <w:r>
+              <w:t>2</w:t>
+            </w:r>
+          </w:p>
+        </w:tc>
+        <w:tc>
+          <w:tcPr>
+            <w:tcW w:w="944" w:type="dxa"/>
+            <w:shd w:val="clear" w:color="auto" w:fill="92D050"/>
+            <w:vAlign w:val="center"/>
+          </w:tcPr>
+          <w:p>
+            <w:pPr>
+              <w:spacing w:after="160" w:line="259" w:lineRule="auto"/>
+            </w:pPr>
+            <w:r>
+              <w:t>0</w:t>
+            </w:r>
+          </w:p>
+        </w:tc>
+        <w:tc>
+          <w:tcPr>
+            <w:tcW w:w="944" w:type="dxa"/>
+            <w:shd w:val="clear" w:color="auto" w:fill="92D050"/>
+            <w:vAlign w:val="center"/>
+          </w:tcPr>
+          <w:p>
+            <w:pPr>
+              <w:spacing w:after="160" w:line="259" w:lineRule="auto"/>
+            </w:pPr>
+            <w:r>
+              <w:t>2</w:t>
+            </w:r>
+          </w:p>
+        </w:tc>
+        <w:tc>
+          <w:tcPr>
+            <w:tcW w:w="944" w:type="dxa"/>
+            <w:shd w:val="clear" w:color="auto" w:fill="92D050"/>
+            <w:vAlign w:val="center"/>
+          </w:tcPr>
+          <w:p>
+            <w:pPr>
+              <w:spacing w:after="160" w:line="259" w:lineRule="auto"/>
+            </w:pPr>
+            <w:r>
+              <w:t>4</w:t>
+            </w:r>
+          </w:p>
+        </w:tc>
+        <w:tc>
+          <w:tcPr>
+            <w:tcW w:w="944" w:type="dxa"/>
+            <w:shd w:val="clear" w:color="auto" w:fill="92D050"/>
+            <w:vAlign w:val="center"/>
+          </w:tcPr>
+          <w:p>
+            <w:pPr>
+              <w:spacing w:after="160" w:line="259" w:lineRule="auto"/>
+            </w:pPr>
+            <w:r>
+              <w:t>2</w:t>
+            </w:r>
+          </w:p>
+        </w:tc>
+        <w:tc>
+          <w:tcPr>
+            <w:tcW w:w="944" w:type="dxa"/>
+            <w:shd w:val="clear" w:color="auto" w:fill="92D050"/>
+            <w:vAlign w:val="center"/>
+          </w:tcPr>
+          <w:p>
+            <w:pPr>
+              <w:spacing w:after="160" w:line="259" w:lineRule="auto"/>
+            </w:pPr>
+            <w:r>
+              <w:t>0</w:t>
+            </w:r>
+          </w:p>
+        </w:tc>
+        <w:tc>
+          <w:tcPr>
+            <w:tcW w:w="944" w:type="dxa"/>
+            <w:shd w:val="clear" w:color="auto" w:fill="92D050"/>
+            <w:vAlign w:val="center"/>
+          </w:tcPr>
+          <w:p>
+            <w:pPr>
+              <w:spacing w:after="160" w:line="259" w:lineRule="auto"/>
+            </w:pPr>
+            <w:r>
+              <w:t>2</w:t>
+            </w:r>
+          </w:p>
+        </w:tc>
+      </w:tr>
+      <w:tr>
+        <w:tc>
+          <w:tcPr>
+            <w:tcW w:w="943" w:type="dxa"/>
+            <w:shd w:val="clear" w:color="auto" w:fill="92D050"/>
+            <w:vAlign w:val="center"/>
+          </w:tcPr>
+          <w:p>
+            <w:pPr>
+              <w:spacing w:after="160" w:line="259" w:lineRule="auto"/>
+            </w:pPr>
+            <w:r>
+              <w:t>2</w:t>
+            </w:r>
+          </w:p>
+        </w:tc>
+        <w:tc>
+          <w:tcPr>
+            <w:tcW w:w="943" w:type="dxa"/>
+            <w:shd w:val="clear" w:color="auto" w:fill="92D050"/>
+            <w:vAlign w:val="center"/>
+          </w:tcPr>
+          <w:p>
+            <w:pPr>
+              <w:spacing w:after="160" w:line="259" w:lineRule="auto"/>
+            </w:pPr>
+            <w:r>
+              <w:t>4</w:t>
+            </w:r>
+          </w:p>
+        </w:tc>
+        <w:tc>
+          <w:tcPr>
+            <w:tcW w:w="944" w:type="dxa"/>
+            <w:shd w:val="clear" w:color="auto" w:fill="92D050"/>
+            <w:vAlign w:val="center"/>
+          </w:tcPr>
+          <w:p>
+            <w:pPr>
+              <w:spacing w:after="160" w:line="259" w:lineRule="auto"/>
+            </w:pPr>
+            <w:r>
+              <w:t>1</w:t>
+            </w:r>
+          </w:p>
+        </w:tc>
+        <w:tc>
+          <w:tcPr>
+            <w:tcW w:w="944" w:type="dxa"/>
+            <w:shd w:val="clear" w:color="auto" w:fill="92D050"/>
+            <w:vAlign w:val="center"/>
+          </w:tcPr>
+          <w:p>
+            <w:pPr>
+              <w:spacing w:after="160" w:line="259" w:lineRule="auto"/>
+            </w:pPr>
+            <w:r>
+              <w:t>0</w:t>
+            </w:r>
+          </w:p>
+        </w:tc>
+        <w:tc>
+          <w:tcPr>
+            <w:tcW w:w="944" w:type="dxa"/>
+            <w:shd w:val="clear" w:color="auto" w:fill="92D050"/>
+            <w:vAlign w:val="center"/>
+          </w:tcPr>
+          <w:p>
+            <w:pPr>
+              <w:spacing w:after="160" w:line="259" w:lineRule="auto"/>
+            </w:pPr>
+            <w:r>
+              <w:t>2</w:t>
+            </w:r>
+          </w:p>
+        </w:tc>
+        <w:tc>
+          <w:tcPr>
+            <w:tcW w:w="944" w:type="dxa"/>
+            <w:shd w:val="clear" w:color="auto" w:fill="92D050"/>
+            <w:vAlign w:val="center"/>
+          </w:tcPr>
+          <w:p>
+            <w:pPr>
+              <w:spacing w:after="160" w:line="259" w:lineRule="auto"/>
+            </w:pPr>
+            <w:r>
+              <w:t>0</w:t>
+            </w:r>
+          </w:p>
+        </w:tc>
+        <w:tc>
+          <w:tcPr>
+            <w:tcW w:w="944" w:type="dxa"/>
+            <w:shd w:val="clear" w:color="auto" w:fill="92D050"/>
+            <w:vAlign w:val="center"/>
+          </w:tcPr>
+          <w:p>
+            <w:pPr>
+              <w:spacing w:after="160" w:line="259" w:lineRule="auto"/>
+            </w:pPr>
+            <w:r>
+              <w:t>3</w:t>
+            </w:r>
+          </w:p>
+        </w:tc>
+        <w:tc>
+          <w:tcPr>
+            <w:tcW w:w="944" w:type="dxa"/>
+            <w:shd w:val="clear" w:color="auto" w:fill="92D050"/>
+            <w:vAlign w:val="center"/>
+          </w:tcPr>
+          <w:p>
+            <w:pPr>
+              <w:spacing w:after="160" w:line="259" w:lineRule="auto"/>
+            </w:pPr>
+            <w:r>
+              <w:t>3</w:t>
+            </w:r>
+          </w:p>
+        </w:tc>
+        <w:tc>
+          <w:tcPr>
+            <w:tcW w:w="944" w:type="dxa"/>
+            <w:shd w:val="clear" w:color="auto" w:fill="92D050"/>
+            <w:vAlign w:val="center"/>
+          </w:tcPr>
+          <w:p>
+            <w:pPr>
+              <w:spacing w:after="160" w:line="259" w:lineRule="auto"/>
+            </w:pPr>
+            <w:r>
+              <w:t>4</w:t>
+            </w:r>
+          </w:p>
+        </w:tc>
+      </w:tr>
+      <w:tr>
+        <w:tc>
+          <w:tcPr>
+            <w:tcW w:w="943" w:type="dxa"/>
+            <w:shd w:val="clear" w:color="auto" w:fill="92D050"/>
+            <w:vAlign w:val="center"/>
+          </w:tcPr>
+          <w:p>
+            <w:pPr>
+              <w:spacing w:after="160" w:line="259" w:lineRule="auto"/>
+            </w:pPr>
+            <w:r>
+              <w:t>H</w:t>
+            </w:r>
+          </w:p>
+        </w:tc>
+        <w:tc>
+          <w:tcPr>
+            <w:tcW w:w="943" w:type="dxa"/>
+            <w:shd w:val="clear" w:color="auto" w:fill="92D050"/>
+            <w:vAlign w:val="center"/>
+          </w:tcPr>
+          <w:p>
+            <w:pPr>
+              <w:spacing w:after="160" w:line="259" w:lineRule="auto"/>
+            </w:pPr>
+            <w:r>
+              <w:t>o</w:t>
+            </w:r>
+          </w:p>
+        </w:tc>
+        <w:tc>
+          <w:tcPr>
+            <w:tcW w:w="944" w:type="dxa"/>
+            <w:shd w:val="clear" w:color="auto" w:fill="92D050"/>
+            <w:vAlign w:val="center"/>
+          </w:tcPr>
+          <w:p>
+            <w:pPr>
+              <w:spacing w:after="160" w:line="259" w:lineRule="auto"/>
+            </w:pPr>
+            <w:r>
+              <w:t>l</w:t>
+            </w:r>
+          </w:p>
+        </w:tc>
+        <w:tc>
+          <w:tcPr>
+            <w:tcW w:w="944" w:type="dxa"/>
+            <w:shd w:val="clear" w:color="auto" w:fill="92D050"/>
+            <w:vAlign w:val="center"/>
+          </w:tcPr>
+          <w:p>
+            <w:pPr>
+              <w:spacing w:after="160" w:line="259" w:lineRule="auto"/>
+            </w:pPr>
+            <w:r>
+              <w:t>a</w:t>
+            </w:r>
+          </w:p>
+        </w:tc>
+        <w:tc>
+          <w:tcPr>
+            <w:tcW w:w="944" w:type="dxa"/>
+            <w:shd w:val="clear" w:color="auto" w:fill="92D050"/>
+            <w:vAlign w:val="center"/>
+          </w:tcPr>
+          <w:p>
+            <w:pPr>
+              <w:spacing w:after="160" w:line="259" w:lineRule="auto"/>
+            </w:pPr>
+            <w:r>
+              <w:t>m</w:t>
+            </w:r>
+          </w:p>
+        </w:tc>
+        <w:tc>
+          <w:tcPr>
+            <w:tcW w:w="944" w:type="dxa"/>
+            <w:shd w:val="clear" w:color="auto" w:fill="92D050"/>
+            <w:vAlign w:val="center"/>
+          </w:tcPr>
+          <w:p>
+            <w:pPr>
+              <w:spacing w:after="160" w:line="259" w:lineRule="auto"/>
+            </w:pPr>
+            <w:r>
+              <w:t>u</w:t>
+            </w:r>
+          </w:p>
+        </w:tc>
+        <w:tc>
+          <w:tcPr>
+            <w:tcW w:w="944" w:type="dxa"/>
+            <w:shd w:val="clear" w:color="auto" w:fill="92D050"/>
+            <w:vAlign w:val="center"/>
+          </w:tcPr>
+          <w:p>
+            <w:pPr>
+              <w:spacing w:after="160" w:line="259" w:lineRule="auto"/>
+            </w:pPr>
+            <w:r>
+              <w:t>n</w:t>
+            </w:r>
+          </w:p>
+        </w:tc>
+        <w:tc>
+          <w:tcPr>
+            <w:tcW w:w="944" w:type="dxa"/>
+            <w:shd w:val="clear" w:color="auto" w:fill="92D050"/>
+            <w:vAlign w:val="center"/>
+          </w:tcPr>
+          <w:p>
+            <w:pPr>
+              <w:spacing w:after="160" w:line="259" w:lineRule="auto"/>
+            </w:pPr>
+            <w:r>
+              <w:t>d</w:t>
+            </w:r>
+          </w:p>
+        </w:tc>
+        <w:tc>
+          <w:tcPr>
+            <w:tcW w:w="944" w:type="dxa"/>
+            <w:shd w:val="clear" w:color="auto" w:fill="92D050"/>
+            <w:vAlign w:val="center"/>
+          </w:tcPr>
+          <w:p>
+            <w:pPr>
+              <w:spacing w:after="160" w:line="259" w:lineRule="auto"/>
+            </w:pPr>
+            <w:r>
+              <w:t>o</w:t>
+            </w:r>
+          </w:p>
+        </w:tc>
+      </w:tr>
+    </w:tbl>
+    <w:p/>
+    <w:p>
+      <w:proofErr w:type="spellStart"/>
       <w:r>
         <w:t>hmeumikdmz</w:t>
       </w:r>
+      <w:proofErr w:type="spellEnd"/>
     </w:p>
+    <w:p/>
     <w:sectPr>
       <w:pgSz w:w="11906" w:h="16838"/>
       <w:pgMar w:top="1417" w:right="1701" w:bottom="1417" w:left="1701" w:header="708" w:footer="708" w:gutter="0"/>
@@ -4491,7 +8219,6 @@
   <w:style w:type="character" w:default="1" w:styleId="Fuentedeprrafopredeter">
     <w:name w:val="Default Paragraph Font"/>
     <w:uiPriority w:val="1"/>
-    <w:semiHidden/>
     <w:unhideWhenUsed/>
   </w:style>
   <w:style w:type="table" w:default="1" w:styleId="Tablanormal">

</xml_diff>